<commit_message>
Regera a documentação Word com sumário estático
O sumário automático exigia atualizar campos ao abrir no Word e travava a
abertura com uma janela de confirmação. Agora o sumário é uma lista estática.

Co-Authored-By: Claude Sonnet 5.5 <noreply@anthropic.com>
</commit_message>
<xml_diff>
--- a/docs/DOCUMENTACAO.docx
+++ b/docs/DOCUMENTACAO.docx
@@ -467,1434 +467,995 @@
     </w:p>
     <w:p>
       <w:pPr>
-        <w:pStyle w:val="Heading1"/>
-      </w:pPr>
-      <w:bookmarkStart w:name="_Toc1" w:id="1"/>
-      <w:r>
+        <w:spacing w:after="200"/>
+      </w:pPr>
+      <w:r>
+        <w:rPr>
+          <w:b/>
+          <w:bCs/>
+          <w:color w:val="0D5C63"/>
+          <w:sz w:val="36"/>
+          <w:szCs w:val="36"/>
+        </w:rPr>
         <w:t xml:space="preserve">Sumário</w:t>
       </w:r>
-      <w:bookmarkEnd w:id="1"/>
-    </w:p>
-    <w:sdt>
-      <w:sdtPr>
-        <w:alias w:val="Sumário"/>
-      </w:sdtPr>
-      <w:sdtContent>
-        <w:p>
-          <w:pPr>
-            <w:pStyle w:val="TOC1"/>
-            <w:tabs>
-              <w:tab w:val="right" w:pos="9026" w:leader="dot"/>
-            </w:tabs>
-          </w:pPr>
-          <w:r>
-            <w:fldChar w:fldCharType="begin" w:dirty="true"/>
-            <w:instrText xml:space="preserve">TOC \h \o "1-2"</w:instrText>
-            <w:fldChar w:fldCharType="separate"/>
-          </w:r>
-          <w:hyperlink w:history="1" w:anchor="_Toc1">
-            <w:r>
-              <w:t xml:space="preserve">Sumário</w:t>
-            </w:r>
-            <w:r>
-              <w:tab/>
-            </w:r>
-            <w:r>
-              <w:fldChar w:fldCharType="begin" w:dirty="true"/>
-              <w:instrText xml:space="preserve">PAGEREF _Toc1 \h</w:instrText>
-              <w:fldChar w:fldCharType="separate"/>
-              <w:fldChar w:fldCharType="end"/>
-            </w:r>
-          </w:hyperlink>
-        </w:p>
-        <w:p>
-          <w:pPr>
-            <w:pStyle w:val="TOC1"/>
-            <w:tabs>
-              <w:tab w:val="right" w:pos="9026" w:leader="dot"/>
-            </w:tabs>
-          </w:pPr>
-          <w:hyperlink w:history="1" w:anchor="_Toc2">
-            <w:r>
-              <w:t xml:space="preserve">1. Introdução</w:t>
-            </w:r>
-            <w:r>
-              <w:tab/>
-            </w:r>
-            <w:r>
-              <w:fldChar w:fldCharType="begin" w:dirty="true"/>
-              <w:instrText xml:space="preserve">PAGEREF _Toc2 \h</w:instrText>
-              <w:fldChar w:fldCharType="separate"/>
-              <w:fldChar w:fldCharType="end"/>
-            </w:r>
-          </w:hyperlink>
-        </w:p>
-        <w:p>
-          <w:pPr>
-            <w:pStyle w:val="TOC2"/>
-            <w:tabs>
-              <w:tab w:val="right" w:pos="9026" w:leader="dot"/>
-            </w:tabs>
-            <w:ind w:left="220"/>
-          </w:pPr>
-          <w:hyperlink w:history="1" w:anchor="_Toc3">
-            <w:r>
-              <w:t xml:space="preserve">1.1 Objetivo</w:t>
-            </w:r>
-            <w:r>
-              <w:tab/>
-            </w:r>
-            <w:r>
-              <w:fldChar w:fldCharType="begin" w:dirty="true"/>
-              <w:instrText xml:space="preserve">PAGEREF _Toc3 \h</w:instrText>
-              <w:fldChar w:fldCharType="separate"/>
-              <w:fldChar w:fldCharType="end"/>
-            </w:r>
-          </w:hyperlink>
-        </w:p>
-        <w:p>
-          <w:pPr>
-            <w:pStyle w:val="TOC2"/>
-            <w:tabs>
-              <w:tab w:val="right" w:pos="9026" w:leader="dot"/>
-            </w:tabs>
-            <w:ind w:left="220"/>
-          </w:pPr>
-          <w:hyperlink w:history="1" w:anchor="_Toc4">
-            <w:r>
-              <w:t xml:space="preserve">1.2 Público e escopo</w:t>
-            </w:r>
-            <w:r>
-              <w:tab/>
-            </w:r>
-            <w:r>
-              <w:fldChar w:fldCharType="begin" w:dirty="true"/>
-              <w:instrText xml:space="preserve">PAGEREF _Toc4 \h</w:instrText>
-              <w:fldChar w:fldCharType="separate"/>
-              <w:fldChar w:fldCharType="end"/>
-            </w:r>
-          </w:hyperlink>
-        </w:p>
-        <w:p>
-          <w:pPr>
-            <w:pStyle w:val="TOC2"/>
-            <w:tabs>
-              <w:tab w:val="right" w:pos="9026" w:leader="dot"/>
-            </w:tabs>
-            <w:ind w:left="220"/>
-          </w:pPr>
-          <w:hyperlink w:history="1" w:anchor="_Toc5">
-            <w:r>
-              <w:t xml:space="preserve">1.3 Glossário</w:t>
-            </w:r>
-            <w:r>
-              <w:tab/>
-            </w:r>
-            <w:r>
-              <w:fldChar w:fldCharType="begin" w:dirty="true"/>
-              <w:instrText xml:space="preserve">PAGEREF _Toc5 \h</w:instrText>
-              <w:fldChar w:fldCharType="separate"/>
-              <w:fldChar w:fldCharType="end"/>
-            </w:r>
-          </w:hyperlink>
-        </w:p>
-        <w:p>
-          <w:pPr>
-            <w:pStyle w:val="TOC1"/>
-            <w:tabs>
-              <w:tab w:val="right" w:pos="9026" w:leader="dot"/>
-            </w:tabs>
-          </w:pPr>
-          <w:hyperlink w:history="1" w:anchor="_Toc6">
-            <w:r>
-              <w:t xml:space="preserve">2. Visão geral da solução</w:t>
-            </w:r>
-            <w:r>
-              <w:tab/>
-            </w:r>
-            <w:r>
-              <w:fldChar w:fldCharType="begin" w:dirty="true"/>
-              <w:instrText xml:space="preserve">PAGEREF _Toc6 \h</w:instrText>
-              <w:fldChar w:fldCharType="separate"/>
-              <w:fldChar w:fldCharType="end"/>
-            </w:r>
-          </w:hyperlink>
-        </w:p>
-        <w:p>
-          <w:pPr>
-            <w:pStyle w:val="TOC2"/>
-            <w:tabs>
-              <w:tab w:val="right" w:pos="9026" w:leader="dot"/>
-            </w:tabs>
-            <w:ind w:left="220"/>
-          </w:pPr>
-          <w:hyperlink w:history="1" w:anchor="_Toc7">
-            <w:r>
-              <w:t xml:space="preserve">2.1 Componentes e estado</w:t>
-            </w:r>
-            <w:r>
-              <w:tab/>
-            </w:r>
-            <w:r>
-              <w:fldChar w:fldCharType="begin" w:dirty="true"/>
-              <w:instrText xml:space="preserve">PAGEREF _Toc7 \h</w:instrText>
-              <w:fldChar w:fldCharType="separate"/>
-              <w:fldChar w:fldCharType="end"/>
-            </w:r>
-          </w:hyperlink>
-        </w:p>
-        <w:p>
-          <w:pPr>
-            <w:pStyle w:val="TOC1"/>
-            <w:tabs>
-              <w:tab w:val="right" w:pos="9026" w:leader="dot"/>
-            </w:tabs>
-          </w:pPr>
-          <w:hyperlink w:history="1" w:anchor="_Toc8">
-            <w:r>
-              <w:t xml:space="preserve">3. Requisitos funcionais</w:t>
-            </w:r>
-            <w:r>
-              <w:tab/>
-            </w:r>
-            <w:r>
-              <w:fldChar w:fldCharType="begin" w:dirty="true"/>
-              <w:instrText xml:space="preserve">PAGEREF _Toc8 \h</w:instrText>
-              <w:fldChar w:fldCharType="separate"/>
-              <w:fldChar w:fldCharType="end"/>
-            </w:r>
-          </w:hyperlink>
-        </w:p>
-        <w:p>
-          <w:pPr>
-            <w:pStyle w:val="TOC1"/>
-            <w:tabs>
-              <w:tab w:val="right" w:pos="9026" w:leader="dot"/>
-            </w:tabs>
-          </w:pPr>
-          <w:hyperlink w:history="1" w:anchor="_Toc9">
-            <w:r>
-              <w:t xml:space="preserve">4. Requisitos não funcionais</w:t>
-            </w:r>
-            <w:r>
-              <w:tab/>
-            </w:r>
-            <w:r>
-              <w:fldChar w:fldCharType="begin" w:dirty="true"/>
-              <w:instrText xml:space="preserve">PAGEREF _Toc9 \h</w:instrText>
-              <w:fldChar w:fldCharType="separate"/>
-              <w:fldChar w:fldCharType="end"/>
-            </w:r>
-          </w:hyperlink>
-        </w:p>
-        <w:p>
-          <w:pPr>
-            <w:pStyle w:val="TOC1"/>
-            <w:tabs>
-              <w:tab w:val="right" w:pos="9026" w:leader="dot"/>
-            </w:tabs>
-          </w:pPr>
-          <w:hyperlink w:history="1" w:anchor="_Toc10">
-            <w:r>
-              <w:t xml:space="preserve">5. Arquitetura</w:t>
-            </w:r>
-            <w:r>
-              <w:tab/>
-            </w:r>
-            <w:r>
-              <w:fldChar w:fldCharType="begin" w:dirty="true"/>
-              <w:instrText xml:space="preserve">PAGEREF _Toc10 \h</w:instrText>
-              <w:fldChar w:fldCharType="separate"/>
-              <w:fldChar w:fldCharType="end"/>
-            </w:r>
-          </w:hyperlink>
-        </w:p>
-        <w:p>
-          <w:pPr>
-            <w:pStyle w:val="TOC2"/>
-            <w:tabs>
-              <w:tab w:val="right" w:pos="9026" w:leader="dot"/>
-            </w:tabs>
-            <w:ind w:left="220"/>
-          </w:pPr>
-          <w:hyperlink w:history="1" w:anchor="_Toc11">
-            <w:r>
-              <w:t xml:space="preserve">5.1 Camadas do app iOS</w:t>
-            </w:r>
-            <w:r>
-              <w:tab/>
-            </w:r>
-            <w:r>
-              <w:fldChar w:fldCharType="begin" w:dirty="true"/>
-              <w:instrText xml:space="preserve">PAGEREF _Toc11 \h</w:instrText>
-              <w:fldChar w:fldCharType="separate"/>
-              <w:fldChar w:fldCharType="end"/>
-            </w:r>
-          </w:hyperlink>
-        </w:p>
-        <w:p>
-          <w:pPr>
-            <w:pStyle w:val="TOC2"/>
-            <w:tabs>
-              <w:tab w:val="right" w:pos="9026" w:leader="dot"/>
-            </w:tabs>
-            <w:ind w:left="220"/>
-          </w:pPr>
-          <w:hyperlink w:history="1" w:anchor="_Toc12">
-            <w:r>
-              <w:t xml:space="preserve">5.2 Decisões de arquitetura</w:t>
-            </w:r>
-            <w:r>
-              <w:tab/>
-            </w:r>
-            <w:r>
-              <w:fldChar w:fldCharType="begin" w:dirty="true"/>
-              <w:instrText xml:space="preserve">PAGEREF _Toc12 \h</w:instrText>
-              <w:fldChar w:fldCharType="separate"/>
-              <w:fldChar w:fldCharType="end"/>
-            </w:r>
-          </w:hyperlink>
-        </w:p>
-        <w:p>
-          <w:pPr>
-            <w:pStyle w:val="TOC2"/>
-            <w:tabs>
-              <w:tab w:val="right" w:pos="9026" w:leader="dot"/>
-            </w:tabs>
-            <w:ind w:left="220"/>
-          </w:pPr>
-          <w:hyperlink w:history="1" w:anchor="_Toc13">
-            <w:r>
-              <w:t xml:space="preserve">5.3 Modelo de dados do Core</w:t>
-            </w:r>
-            <w:r>
-              <w:tab/>
-            </w:r>
-            <w:r>
-              <w:fldChar w:fldCharType="begin" w:dirty="true"/>
-              <w:instrText xml:space="preserve">PAGEREF _Toc13 \h</w:instrText>
-              <w:fldChar w:fldCharType="separate"/>
-              <w:fldChar w:fldCharType="end"/>
-            </w:r>
-          </w:hyperlink>
-        </w:p>
-        <w:p>
-          <w:pPr>
-            <w:pStyle w:val="TOC1"/>
-            <w:tabs>
-              <w:tab w:val="right" w:pos="9026" w:leader="dot"/>
-            </w:tabs>
-          </w:pPr>
-          <w:hyperlink w:history="1" w:anchor="_Toc14">
-            <w:r>
-              <w:t xml:space="preserve">6. App iOS</w:t>
-            </w:r>
-            <w:r>
-              <w:tab/>
-            </w:r>
-            <w:r>
-              <w:fldChar w:fldCharType="begin" w:dirty="true"/>
-              <w:instrText xml:space="preserve">PAGEREF _Toc14 \h</w:instrText>
-              <w:fldChar w:fldCharType="separate"/>
-              <w:fldChar w:fldCharType="end"/>
-            </w:r>
-          </w:hyperlink>
-        </w:p>
-        <w:p>
-          <w:pPr>
-            <w:pStyle w:val="TOC2"/>
-            <w:tabs>
-              <w:tab w:val="right" w:pos="9026" w:leader="dot"/>
-            </w:tabs>
-            <w:ind w:left="220"/>
-          </w:pPr>
-          <w:hyperlink w:history="1" w:anchor="_Toc15">
-            <w:r>
-              <w:t xml:space="preserve">6.1 Motores do Core</w:t>
-            </w:r>
-            <w:r>
-              <w:tab/>
-            </w:r>
-            <w:r>
-              <w:fldChar w:fldCharType="begin" w:dirty="true"/>
-              <w:instrText xml:space="preserve">PAGEREF _Toc15 \h</w:instrText>
-              <w:fldChar w:fldCharType="separate"/>
-              <w:fldChar w:fldCharType="end"/>
-            </w:r>
-          </w:hyperlink>
-        </w:p>
-        <w:p>
-          <w:pPr>
-            <w:pStyle w:val="TOC2"/>
-            <w:tabs>
-              <w:tab w:val="right" w:pos="9026" w:leader="dot"/>
-            </w:tabs>
-            <w:ind w:left="220"/>
-          </w:pPr>
-          <w:hyperlink w:history="1" w:anchor="_Toc16">
-            <w:r>
-              <w:t xml:space="preserve">6.2 Navegação e telas</w:t>
-            </w:r>
-            <w:r>
-              <w:tab/>
-            </w:r>
-            <w:r>
-              <w:fldChar w:fldCharType="begin" w:dirty="true"/>
-              <w:instrText xml:space="preserve">PAGEREF _Toc16 \h</w:instrText>
-              <w:fldChar w:fldCharType="separate"/>
-              <w:fldChar w:fldCharType="end"/>
-            </w:r>
-          </w:hyperlink>
-        </w:p>
-        <w:p>
-          <w:pPr>
-            <w:pStyle w:val="TOC2"/>
-            <w:tabs>
-              <w:tab w:val="right" w:pos="9026" w:leader="dot"/>
-            </w:tabs>
-            <w:ind w:left="220"/>
-          </w:pPr>
-          <w:hyperlink w:history="1" w:anchor="_Toc17">
-            <w:r>
-              <w:t xml:space="preserve">6.3 Seletor de mês e atualização</w:t>
-            </w:r>
-            <w:r>
-              <w:tab/>
-            </w:r>
-            <w:r>
-              <w:fldChar w:fldCharType="begin" w:dirty="true"/>
-              <w:instrText xml:space="preserve">PAGEREF _Toc17 \h</w:instrText>
-              <w:fldChar w:fldCharType="separate"/>
-              <w:fldChar w:fldCharType="end"/>
-            </w:r>
-          </w:hyperlink>
-        </w:p>
-        <w:p>
-          <w:pPr>
-            <w:pStyle w:val="TOC2"/>
-            <w:tabs>
-              <w:tab w:val="right" w:pos="9026" w:leader="dot"/>
-            </w:tabs>
-            <w:ind w:left="220"/>
-          </w:pPr>
-          <w:hyperlink w:history="1" w:anchor="_Toc18">
-            <w:r>
-              <w:t xml:space="preserve">6.4 Projeto e build</w:t>
-            </w:r>
-            <w:r>
-              <w:tab/>
-            </w:r>
-            <w:r>
-              <w:fldChar w:fldCharType="begin" w:dirty="true"/>
-              <w:instrText xml:space="preserve">PAGEREF _Toc18 \h</w:instrText>
-              <w:fldChar w:fldCharType="separate"/>
-              <w:fldChar w:fldCharType="end"/>
-            </w:r>
-          </w:hyperlink>
-        </w:p>
-        <w:p>
-          <w:pPr>
-            <w:pStyle w:val="TOC1"/>
-            <w:tabs>
-              <w:tab w:val="right" w:pos="9026" w:leader="dot"/>
-            </w:tabs>
-          </w:pPr>
-          <w:hyperlink w:history="1" w:anchor="_Toc19">
-            <w:r>
-              <w:t xml:space="preserve">7. Regras de negócio</w:t>
-            </w:r>
-            <w:r>
-              <w:tab/>
-            </w:r>
-            <w:r>
-              <w:fldChar w:fldCharType="begin" w:dirty="true"/>
-              <w:instrText xml:space="preserve">PAGEREF _Toc19 \h</w:instrText>
-              <w:fldChar w:fldCharType="separate"/>
-              <w:fldChar w:fldCharType="end"/>
-            </w:r>
-          </w:hyperlink>
-        </w:p>
-        <w:p>
-          <w:pPr>
-            <w:pStyle w:val="TOC2"/>
-            <w:tabs>
-              <w:tab w:val="right" w:pos="9026" w:leader="dot"/>
-            </w:tabs>
-            <w:ind w:left="220"/>
-          </w:pPr>
-          <w:hyperlink w:history="1" w:anchor="_Toc20">
-            <w:r>
-              <w:t xml:space="preserve">7.1 Cartão de crédito e fatura</w:t>
-            </w:r>
-            <w:r>
-              <w:tab/>
-            </w:r>
-            <w:r>
-              <w:fldChar w:fldCharType="begin" w:dirty="true"/>
-              <w:instrText xml:space="preserve">PAGEREF _Toc20 \h</w:instrText>
-              <w:fldChar w:fldCharType="separate"/>
-              <w:fldChar w:fldCharType="end"/>
-            </w:r>
-          </w:hyperlink>
-        </w:p>
-        <w:p>
-          <w:pPr>
-            <w:pStyle w:val="TOC2"/>
-            <w:tabs>
-              <w:tab w:val="right" w:pos="9026" w:leader="dot"/>
-            </w:tabs>
-            <w:ind w:left="220"/>
-          </w:pPr>
-          <w:hyperlink w:history="1" w:anchor="_Toc21">
-            <w:r>
-              <w:t xml:space="preserve">7.2 Parcelas e recorrência</w:t>
-            </w:r>
-            <w:r>
-              <w:tab/>
-            </w:r>
-            <w:r>
-              <w:fldChar w:fldCharType="begin" w:dirty="true"/>
-              <w:instrText xml:space="preserve">PAGEREF _Toc21 \h</w:instrText>
-              <w:fldChar w:fldCharType="separate"/>
-              <w:fldChar w:fldCharType="end"/>
-            </w:r>
-          </w:hyperlink>
-        </w:p>
-        <w:p>
-          <w:pPr>
-            <w:pStyle w:val="TOC2"/>
-            <w:tabs>
-              <w:tab w:val="right" w:pos="9026" w:leader="dot"/>
-            </w:tabs>
-            <w:ind w:left="220"/>
-          </w:pPr>
-          <w:hyperlink w:history="1" w:anchor="_Toc22">
-            <w:r>
-              <w:t xml:space="preserve">7.3 Orçamento</w:t>
-            </w:r>
-            <w:r>
-              <w:tab/>
-            </w:r>
-            <w:r>
-              <w:fldChar w:fldCharType="begin" w:dirty="true"/>
-              <w:instrText xml:space="preserve">PAGEREF _Toc22 \h</w:instrText>
-              <w:fldChar w:fldCharType="separate"/>
-              <w:fldChar w:fldCharType="end"/>
-            </w:r>
-          </w:hyperlink>
-        </w:p>
-        <w:p>
-          <w:pPr>
-            <w:pStyle w:val="TOC2"/>
-            <w:tabs>
-              <w:tab w:val="right" w:pos="9026" w:leader="dot"/>
-            </w:tabs>
-            <w:ind w:left="220"/>
-          </w:pPr>
-          <w:hyperlink w:history="1" w:anchor="_Toc23">
-            <w:r>
-              <w:t xml:space="preserve">7.4 Família</w:t>
-            </w:r>
-            <w:r>
-              <w:tab/>
-            </w:r>
-            <w:r>
-              <w:fldChar w:fldCharType="begin" w:dirty="true"/>
-              <w:instrText xml:space="preserve">PAGEREF _Toc23 \h</w:instrText>
-              <w:fldChar w:fldCharType="separate"/>
-              <w:fldChar w:fldCharType="end"/>
-            </w:r>
-          </w:hyperlink>
-        </w:p>
-        <w:p>
-          <w:pPr>
-            <w:pStyle w:val="TOC2"/>
-            <w:tabs>
-              <w:tab w:val="right" w:pos="9026" w:leader="dot"/>
-            </w:tabs>
-            <w:ind w:left="220"/>
-          </w:pPr>
-          <w:hyperlink w:history="1" w:anchor="_Toc24">
-            <w:r>
-              <w:t xml:space="preserve">7.5 Dívidas, metas e insights</w:t>
-            </w:r>
-            <w:r>
-              <w:tab/>
-            </w:r>
-            <w:r>
-              <w:fldChar w:fldCharType="begin" w:dirty="true"/>
-              <w:instrText xml:space="preserve">PAGEREF _Toc24 \h</w:instrText>
-              <w:fldChar w:fldCharType="separate"/>
-              <w:fldChar w:fldCharType="end"/>
-            </w:r>
-          </w:hyperlink>
-        </w:p>
-        <w:p>
-          <w:pPr>
-            <w:pStyle w:val="TOC2"/>
-            <w:tabs>
-              <w:tab w:val="right" w:pos="9026" w:leader="dot"/>
-            </w:tabs>
-            <w:ind w:left="220"/>
-          </w:pPr>
-          <w:hyperlink w:history="1" w:anchor="_Toc25">
-            <w:r>
-              <w:t xml:space="preserve">7.6 Imposto de Renda</w:t>
-            </w:r>
-            <w:r>
-              <w:tab/>
-            </w:r>
-            <w:r>
-              <w:fldChar w:fldCharType="begin" w:dirty="true"/>
-              <w:instrText xml:space="preserve">PAGEREF _Toc25 \h</w:instrText>
-              <w:fldChar w:fldCharType="separate"/>
-              <w:fldChar w:fldCharType="end"/>
-            </w:r>
-          </w:hyperlink>
-        </w:p>
-        <w:p>
-          <w:pPr>
-            <w:pStyle w:val="TOC1"/>
-            <w:tabs>
-              <w:tab w:val="right" w:pos="9026" w:leader="dot"/>
-            </w:tabs>
-          </w:pPr>
-          <w:hyperlink w:history="1" w:anchor="_Toc26">
-            <w:r>
-              <w:t xml:space="preserve">8. Versão web</w:t>
-            </w:r>
-            <w:r>
-              <w:tab/>
-            </w:r>
-            <w:r>
-              <w:fldChar w:fldCharType="begin" w:dirty="true"/>
-              <w:instrText xml:space="preserve">PAGEREF _Toc26 \h</w:instrText>
-              <w:fldChar w:fldCharType="separate"/>
-              <w:fldChar w:fldCharType="end"/>
-            </w:r>
-          </w:hyperlink>
-        </w:p>
-        <w:p>
-          <w:pPr>
-            <w:pStyle w:val="TOC2"/>
-            <w:tabs>
-              <w:tab w:val="right" w:pos="9026" w:leader="dot"/>
-            </w:tabs>
-            <w:ind w:left="220"/>
-          </w:pPr>
-          <w:hyperlink w:history="1" w:anchor="_Toc27">
-            <w:r>
-              <w:t xml:space="preserve">8.1 Stack e estrutura</w:t>
-            </w:r>
-            <w:r>
-              <w:tab/>
-            </w:r>
-            <w:r>
-              <w:fldChar w:fldCharType="begin" w:dirty="true"/>
-              <w:instrText xml:space="preserve">PAGEREF _Toc27 \h</w:instrText>
-              <w:fldChar w:fldCharType="separate"/>
-              <w:fldChar w:fldCharType="end"/>
-            </w:r>
-          </w:hyperlink>
-        </w:p>
-        <w:p>
-          <w:pPr>
-            <w:pStyle w:val="TOC2"/>
-            <w:tabs>
-              <w:tab w:val="right" w:pos="9026" w:leader="dot"/>
-            </w:tabs>
-            <w:ind w:left="220"/>
-          </w:pPr>
-          <w:hyperlink w:history="1" w:anchor="_Toc28">
-            <w:r>
-              <w:t xml:space="preserve">8.2 Paridade com o app iOS</w:t>
-            </w:r>
-            <w:r>
-              <w:tab/>
-            </w:r>
-            <w:r>
-              <w:fldChar w:fldCharType="begin" w:dirty="true"/>
-              <w:instrText xml:space="preserve">PAGEREF _Toc28 \h</w:instrText>
-              <w:fldChar w:fldCharType="separate"/>
-              <w:fldChar w:fldCharType="end"/>
-            </w:r>
-          </w:hyperlink>
-        </w:p>
-        <w:p>
-          <w:pPr>
-            <w:pStyle w:val="TOC2"/>
-            <w:tabs>
-              <w:tab w:val="right" w:pos="9026" w:leader="dot"/>
-            </w:tabs>
-            <w:ind w:left="220"/>
-          </w:pPr>
-          <w:hyperlink w:history="1" w:anchor="_Toc29">
-            <w:r>
-              <w:t xml:space="preserve">8.3 Telas</w:t>
-            </w:r>
-            <w:r>
-              <w:tab/>
-            </w:r>
-            <w:r>
-              <w:fldChar w:fldCharType="begin" w:dirty="true"/>
-              <w:instrText xml:space="preserve">PAGEREF _Toc29 \h</w:instrText>
-              <w:fldChar w:fldCharType="separate"/>
-              <w:fldChar w:fldCharType="end"/>
-            </w:r>
-          </w:hyperlink>
-        </w:p>
-        <w:p>
-          <w:pPr>
-            <w:pStyle w:val="TOC2"/>
-            <w:tabs>
-              <w:tab w:val="right" w:pos="9026" w:leader="dot"/>
-            </w:tabs>
-            <w:ind w:left="220"/>
-          </w:pPr>
-          <w:hyperlink w:history="1" w:anchor="_Toc30">
-            <w:r>
-              <w:t xml:space="preserve">8.4 Fora da versão web</w:t>
-            </w:r>
-            <w:r>
-              <w:tab/>
-            </w:r>
-            <w:r>
-              <w:fldChar w:fldCharType="begin" w:dirty="true"/>
-              <w:instrText xml:space="preserve">PAGEREF _Toc30 \h</w:instrText>
-              <w:fldChar w:fldCharType="separate"/>
-              <w:fldChar w:fldCharType="end"/>
-            </w:r>
-          </w:hyperlink>
-        </w:p>
-        <w:p>
-          <w:pPr>
-            <w:pStyle w:val="TOC1"/>
-            <w:tabs>
-              <w:tab w:val="right" w:pos="9026" w:leader="dot"/>
-            </w:tabs>
-          </w:pPr>
-          <w:hyperlink w:history="1" w:anchor="_Toc31">
-            <w:r>
-              <w:t xml:space="preserve">9. Backend</w:t>
-            </w:r>
-            <w:r>
-              <w:tab/>
-            </w:r>
-            <w:r>
-              <w:fldChar w:fldCharType="begin" w:dirty="true"/>
-              <w:instrText xml:space="preserve">PAGEREF _Toc31 \h</w:instrText>
-              <w:fldChar w:fldCharType="separate"/>
-              <w:fldChar w:fldCharType="end"/>
-            </w:r>
-          </w:hyperlink>
-        </w:p>
-        <w:p>
-          <w:pPr>
-            <w:pStyle w:val="TOC2"/>
-            <w:tabs>
-              <w:tab w:val="right" w:pos="9026" w:leader="dot"/>
-            </w:tabs>
-            <w:ind w:left="220"/>
-          </w:pPr>
-          <w:hyperlink w:history="1" w:anchor="_Toc32">
-            <w:r>
-              <w:t xml:space="preserve">9.1 Endpoints da API</w:t>
-            </w:r>
-            <w:r>
-              <w:tab/>
-            </w:r>
-            <w:r>
-              <w:fldChar w:fldCharType="begin" w:dirty="true"/>
-              <w:instrText xml:space="preserve">PAGEREF _Toc32 \h</w:instrText>
-              <w:fldChar w:fldCharType="separate"/>
-              <w:fldChar w:fldCharType="end"/>
-            </w:r>
-          </w:hyperlink>
-        </w:p>
-        <w:p>
-          <w:pPr>
-            <w:pStyle w:val="TOC2"/>
-            <w:tabs>
-              <w:tab w:val="right" w:pos="9026" w:leader="dot"/>
-            </w:tabs>
-            <w:ind w:left="220"/>
-          </w:pPr>
-          <w:hyperlink w:history="1" w:anchor="_Toc33">
-            <w:r>
-              <w:t xml:space="preserve">9.2 Modelo do banco</w:t>
-            </w:r>
-            <w:r>
-              <w:tab/>
-            </w:r>
-            <w:r>
-              <w:fldChar w:fldCharType="begin" w:dirty="true"/>
-              <w:instrText xml:space="preserve">PAGEREF _Toc33 \h</w:instrText>
-              <w:fldChar w:fldCharType="separate"/>
-              <w:fldChar w:fldCharType="end"/>
-            </w:r>
-          </w:hyperlink>
-        </w:p>
-        <w:p>
-          <w:pPr>
-            <w:pStyle w:val="TOC2"/>
-            <w:tabs>
-              <w:tab w:val="right" w:pos="9026" w:leader="dot"/>
-            </w:tabs>
-            <w:ind w:left="220"/>
-          </w:pPr>
-          <w:hyperlink w:history="1" w:anchor="_Toc34">
-            <w:r>
-              <w:t xml:space="preserve">9.3 Migrações</w:t>
-            </w:r>
-            <w:r>
-              <w:tab/>
-            </w:r>
-            <w:r>
-              <w:fldChar w:fldCharType="begin" w:dirty="true"/>
-              <w:instrText xml:space="preserve">PAGEREF _Toc34 \h</w:instrText>
-              <w:fldChar w:fldCharType="separate"/>
-              <w:fldChar w:fldCharType="end"/>
-            </w:r>
-          </w:hyperlink>
-        </w:p>
-        <w:p>
-          <w:pPr>
-            <w:pStyle w:val="TOC2"/>
-            <w:tabs>
-              <w:tab w:val="right" w:pos="9026" w:leader="dot"/>
-            </w:tabs>
-            <w:ind w:left="220"/>
-          </w:pPr>
-          <w:hyperlink w:history="1" w:anchor="_Toc35">
-            <w:r>
-              <w:t xml:space="preserve">9.4 Docker Compose</w:t>
-            </w:r>
-            <w:r>
-              <w:tab/>
-            </w:r>
-            <w:r>
-              <w:fldChar w:fldCharType="begin" w:dirty="true"/>
-              <w:instrText xml:space="preserve">PAGEREF _Toc35 \h</w:instrText>
-              <w:fldChar w:fldCharType="separate"/>
-              <w:fldChar w:fldCharType="end"/>
-            </w:r>
-          </w:hyperlink>
-        </w:p>
-        <w:p>
-          <w:pPr>
-            <w:pStyle w:val="TOC2"/>
-            <w:tabs>
-              <w:tab w:val="right" w:pos="9026" w:leader="dot"/>
-            </w:tabs>
-            <w:ind w:left="220"/>
-          </w:pPr>
-          <w:hyperlink w:history="1" w:anchor="_Toc36">
-            <w:r>
-              <w:t xml:space="preserve">9.5 Variáveis de ambiente</w:t>
-            </w:r>
-            <w:r>
-              <w:tab/>
-            </w:r>
-            <w:r>
-              <w:fldChar w:fldCharType="begin" w:dirty="true"/>
-              <w:instrText xml:space="preserve">PAGEREF _Toc36 \h</w:instrText>
-              <w:fldChar w:fldCharType="separate"/>
-              <w:fldChar w:fldCharType="end"/>
-            </w:r>
-          </w:hyperlink>
-        </w:p>
-        <w:p>
-          <w:pPr>
-            <w:pStyle w:val="TOC1"/>
-            <w:tabs>
-              <w:tab w:val="right" w:pos="9026" w:leader="dot"/>
-            </w:tabs>
-          </w:pPr>
-          <w:hyperlink w:history="1" w:anchor="_Toc37">
-            <w:r>
-              <w:t xml:space="preserve">10. Sincronização</w:t>
-            </w:r>
-            <w:r>
-              <w:tab/>
-            </w:r>
-            <w:r>
-              <w:fldChar w:fldCharType="begin" w:dirty="true"/>
-              <w:instrText xml:space="preserve">PAGEREF _Toc37 \h</w:instrText>
-              <w:fldChar w:fldCharType="separate"/>
-              <w:fldChar w:fldCharType="end"/>
-            </w:r>
-          </w:hyperlink>
-        </w:p>
-        <w:p>
-          <w:pPr>
-            <w:pStyle w:val="TOC2"/>
-            <w:tabs>
-              <w:tab w:val="right" w:pos="9026" w:leader="dot"/>
-            </w:tabs>
-            <w:ind w:left="220"/>
-          </w:pPr>
-          <w:hyperlink w:history="1" w:anchor="_Toc38">
-            <w:r>
-              <w:t xml:space="preserve">10.1 Regra de conflito</w:t>
-            </w:r>
-            <w:r>
-              <w:tab/>
-            </w:r>
-            <w:r>
-              <w:fldChar w:fldCharType="begin" w:dirty="true"/>
-              <w:instrText xml:space="preserve">PAGEREF _Toc38 \h</w:instrText>
-              <w:fldChar w:fldCharType="separate"/>
-              <w:fldChar w:fldCharType="end"/>
-            </w:r>
-          </w:hyperlink>
-        </w:p>
-        <w:p>
-          <w:pPr>
-            <w:pStyle w:val="TOC2"/>
-            <w:tabs>
-              <w:tab w:val="right" w:pos="9026" w:leader="dot"/>
-            </w:tabs>
-            <w:ind w:left="220"/>
-          </w:pPr>
-          <w:hyperlink w:history="1" w:anchor="_Toc39">
-            <w:r>
-              <w:t xml:space="preserve">10.2 Pontos de atenção para o cliente</w:t>
-            </w:r>
-            <w:r>
-              <w:tab/>
-            </w:r>
-            <w:r>
-              <w:fldChar w:fldCharType="begin" w:dirty="true"/>
-              <w:instrText xml:space="preserve">PAGEREF _Toc39 \h</w:instrText>
-              <w:fldChar w:fldCharType="separate"/>
-              <w:fldChar w:fldCharType="end"/>
-            </w:r>
-          </w:hyperlink>
-        </w:p>
-        <w:p>
-          <w:pPr>
-            <w:pStyle w:val="TOC1"/>
-            <w:tabs>
-              <w:tab w:val="right" w:pos="9026" w:leader="dot"/>
-            </w:tabs>
-          </w:pPr>
-          <w:hyperlink w:history="1" w:anchor="_Toc40">
-            <w:r>
-              <w:t xml:space="preserve">11. Design</w:t>
-            </w:r>
-            <w:r>
-              <w:tab/>
-            </w:r>
-            <w:r>
-              <w:fldChar w:fldCharType="begin" w:dirty="true"/>
-              <w:instrText xml:space="preserve">PAGEREF _Toc40 \h</w:instrText>
-              <w:fldChar w:fldCharType="separate"/>
-              <w:fldChar w:fldCharType="end"/>
-            </w:r>
-          </w:hyperlink>
-        </w:p>
-        <w:p>
-          <w:pPr>
-            <w:pStyle w:val="TOC1"/>
-            <w:tabs>
-              <w:tab w:val="right" w:pos="9026" w:leader="dot"/>
-            </w:tabs>
-          </w:pPr>
-          <w:hyperlink w:history="1" w:anchor="_Toc41">
-            <w:r>
-              <w:t xml:space="preserve">12. Qualidade e testes</w:t>
-            </w:r>
-            <w:r>
-              <w:tab/>
-            </w:r>
-            <w:r>
-              <w:fldChar w:fldCharType="begin" w:dirty="true"/>
-              <w:instrText xml:space="preserve">PAGEREF _Toc41 \h</w:instrText>
-              <w:fldChar w:fldCharType="separate"/>
-              <w:fldChar w:fldCharType="end"/>
-            </w:r>
-          </w:hyperlink>
-        </w:p>
-        <w:p>
-          <w:pPr>
-            <w:pStyle w:val="TOC2"/>
-            <w:tabs>
-              <w:tab w:val="right" w:pos="9026" w:leader="dot"/>
-            </w:tabs>
-            <w:ind w:left="220"/>
-          </w:pPr>
-          <w:hyperlink w:history="1" w:anchor="_Toc42">
-            <w:r>
-              <w:t xml:space="preserve">12.1 Estratégia</w:t>
-            </w:r>
-            <w:r>
-              <w:tab/>
-            </w:r>
-            <w:r>
-              <w:fldChar w:fldCharType="begin" w:dirty="true"/>
-              <w:instrText xml:space="preserve">PAGEREF _Toc42 \h</w:instrText>
-              <w:fldChar w:fldCharType="separate"/>
-              <w:fldChar w:fldCharType="end"/>
-            </w:r>
-          </w:hyperlink>
-        </w:p>
-        <w:p>
-          <w:pPr>
-            <w:pStyle w:val="TOC2"/>
-            <w:tabs>
-              <w:tab w:val="right" w:pos="9026" w:leader="dot"/>
-            </w:tabs>
-            <w:ind w:left="220"/>
-          </w:pPr>
-          <w:hyperlink w:history="1" w:anchor="_Toc43">
-            <w:r>
-              <w:t xml:space="preserve">12.2 O que não foi verificado</w:t>
-            </w:r>
-            <w:r>
-              <w:tab/>
-            </w:r>
-            <w:r>
-              <w:fldChar w:fldCharType="begin" w:dirty="true"/>
-              <w:instrText xml:space="preserve">PAGEREF _Toc43 \h</w:instrText>
-              <w:fldChar w:fldCharType="separate"/>
-              <w:fldChar w:fldCharType="end"/>
-            </w:r>
-          </w:hyperlink>
-        </w:p>
-        <w:p>
-          <w:pPr>
-            <w:pStyle w:val="TOC1"/>
-            <w:tabs>
-              <w:tab w:val="right" w:pos="9026" w:leader="dot"/>
-            </w:tabs>
-          </w:pPr>
-          <w:hyperlink w:history="1" w:anchor="_Toc44">
-            <w:r>
-              <w:t xml:space="preserve">13. Operação</w:t>
-            </w:r>
-            <w:r>
-              <w:tab/>
-            </w:r>
-            <w:r>
-              <w:fldChar w:fldCharType="begin" w:dirty="true"/>
-              <w:instrText xml:space="preserve">PAGEREF _Toc44 \h</w:instrText>
-              <w:fldChar w:fldCharType="separate"/>
-              <w:fldChar w:fldCharType="end"/>
-            </w:r>
-          </w:hyperlink>
-        </w:p>
-        <w:p>
-          <w:pPr>
-            <w:pStyle w:val="TOC2"/>
-            <w:tabs>
-              <w:tab w:val="right" w:pos="9026" w:leader="dot"/>
-            </w:tabs>
-            <w:ind w:left="220"/>
-          </w:pPr>
-          <w:hyperlink w:history="1" w:anchor="_Toc45">
-            <w:r>
-              <w:t xml:space="preserve">13.1 Subir o ambiente</w:t>
-            </w:r>
-            <w:r>
-              <w:tab/>
-            </w:r>
-            <w:r>
-              <w:fldChar w:fldCharType="begin" w:dirty="true"/>
-              <w:instrText xml:space="preserve">PAGEREF _Toc45 \h</w:instrText>
-              <w:fldChar w:fldCharType="separate"/>
-              <w:fldChar w:fldCharType="end"/>
-            </w:r>
-          </w:hyperlink>
-        </w:p>
-        <w:p>
-          <w:pPr>
-            <w:pStyle w:val="TOC2"/>
-            <w:tabs>
-              <w:tab w:val="right" w:pos="9026" w:leader="dot"/>
-            </w:tabs>
-            <w:ind w:left="220"/>
-          </w:pPr>
-          <w:hyperlink w:history="1" w:anchor="_Toc46">
-            <w:r>
-              <w:t xml:space="preserve">13.2 Acesso pela internet</w:t>
-            </w:r>
-            <w:r>
-              <w:tab/>
-            </w:r>
-            <w:r>
-              <w:fldChar w:fldCharType="begin" w:dirty="true"/>
-              <w:instrText xml:space="preserve">PAGEREF _Toc46 \h</w:instrText>
-              <w:fldChar w:fldCharType="separate"/>
-              <w:fldChar w:fldCharType="end"/>
-            </w:r>
-          </w:hyperlink>
-        </w:p>
-        <w:p>
-          <w:pPr>
-            <w:pStyle w:val="TOC2"/>
-            <w:tabs>
-              <w:tab w:val="right" w:pos="9026" w:leader="dot"/>
-            </w:tabs>
-            <w:ind w:left="220"/>
-          </w:pPr>
-          <w:hyperlink w:history="1" w:anchor="_Toc47">
-            <w:r>
-              <w:t xml:space="preserve">13.3 Backup e restauração</w:t>
-            </w:r>
-            <w:r>
-              <w:tab/>
-            </w:r>
-            <w:r>
-              <w:fldChar w:fldCharType="begin" w:dirty="true"/>
-              <w:instrText xml:space="preserve">PAGEREF _Toc47 \h</w:instrText>
-              <w:fldChar w:fldCharType="separate"/>
-              <w:fldChar w:fldCharType="end"/>
-            </w:r>
-          </w:hyperlink>
-        </w:p>
-        <w:p>
-          <w:pPr>
-            <w:pStyle w:val="TOC2"/>
-            <w:tabs>
-              <w:tab w:val="right" w:pos="9026" w:leader="dot"/>
-            </w:tabs>
-            <w:ind w:left="220"/>
-          </w:pPr>
-          <w:hyperlink w:history="1" w:anchor="_Toc48">
-            <w:r>
-              <w:t xml:space="preserve">13.4 Painel de agentes</w:t>
-            </w:r>
-            <w:r>
-              <w:tab/>
-            </w:r>
-            <w:r>
-              <w:fldChar w:fldCharType="begin" w:dirty="true"/>
-              <w:instrText xml:space="preserve">PAGEREF _Toc48 \h</w:instrText>
-              <w:fldChar w:fldCharType="separate"/>
-              <w:fldChar w:fldCharType="end"/>
-            </w:r>
-          </w:hyperlink>
-        </w:p>
-        <w:p>
-          <w:pPr>
-            <w:pStyle w:val="TOC2"/>
-            <w:tabs>
-              <w:tab w:val="right" w:pos="9026" w:leader="dot"/>
-            </w:tabs>
-            <w:ind w:left="220"/>
-          </w:pPr>
-          <w:hyperlink w:history="1" w:anchor="_Toc49">
-            <w:r>
-              <w:t xml:space="preserve">13.5 Instalação em iPhone</w:t>
-            </w:r>
-            <w:r>
-              <w:tab/>
-            </w:r>
-            <w:r>
-              <w:fldChar w:fldCharType="begin" w:dirty="true"/>
-              <w:instrText xml:space="preserve">PAGEREF _Toc49 \h</w:instrText>
-              <w:fldChar w:fldCharType="separate"/>
-              <w:fldChar w:fldCharType="end"/>
-            </w:r>
-          </w:hyperlink>
-        </w:p>
-        <w:p>
-          <w:pPr>
-            <w:pStyle w:val="TOC2"/>
-            <w:tabs>
-              <w:tab w:val="right" w:pos="9026" w:leader="dot"/>
-            </w:tabs>
-            <w:ind w:left="220"/>
-          </w:pPr>
-          <w:hyperlink w:history="1" w:anchor="_Toc50">
-            <w:r>
-              <w:t xml:space="preserve">13.6 Ferramentas de apoio</w:t>
-            </w:r>
-            <w:r>
-              <w:tab/>
-            </w:r>
-            <w:r>
-              <w:fldChar w:fldCharType="begin" w:dirty="true"/>
-              <w:instrText xml:space="preserve">PAGEREF _Toc50 \h</w:instrText>
-              <w:fldChar w:fldCharType="separate"/>
-              <w:fldChar w:fldCharType="end"/>
-            </w:r>
-          </w:hyperlink>
-        </w:p>
-        <w:p>
-          <w:pPr>
-            <w:pStyle w:val="TOC1"/>
-            <w:tabs>
-              <w:tab w:val="right" w:pos="9026" w:leader="dot"/>
-            </w:tabs>
-          </w:pPr>
-          <w:hyperlink w:history="1" w:anchor="_Toc51">
-            <w:r>
-              <w:t xml:space="preserve">14. Segurança e privacidade</w:t>
-            </w:r>
-            <w:r>
-              <w:tab/>
-            </w:r>
-            <w:r>
-              <w:fldChar w:fldCharType="begin" w:dirty="true"/>
-              <w:instrText xml:space="preserve">PAGEREF _Toc51 \h</w:instrText>
-              <w:fldChar w:fldCharType="separate"/>
-              <w:fldChar w:fldCharType="end"/>
-            </w:r>
-          </w:hyperlink>
-        </w:p>
-        <w:p>
-          <w:pPr>
-            <w:pStyle w:val="TOC2"/>
-            <w:tabs>
-              <w:tab w:val="right" w:pos="9026" w:leader="dot"/>
-            </w:tabs>
-            <w:ind w:left="220"/>
-          </w:pPr>
-          <w:hyperlink w:history="1" w:anchor="_Toc52">
-            <w:r>
-              <w:t xml:space="preserve">14.1 LGPD</w:t>
-            </w:r>
-            <w:r>
-              <w:tab/>
-            </w:r>
-            <w:r>
-              <w:fldChar w:fldCharType="begin" w:dirty="true"/>
-              <w:instrText xml:space="preserve">PAGEREF _Toc52 \h</w:instrText>
-              <w:fldChar w:fldCharType="separate"/>
-              <w:fldChar w:fldCharType="end"/>
-            </w:r>
-          </w:hyperlink>
-        </w:p>
-        <w:p>
-          <w:pPr>
-            <w:pStyle w:val="TOC1"/>
-            <w:tabs>
-              <w:tab w:val="right" w:pos="9026" w:leader="dot"/>
-            </w:tabs>
-          </w:pPr>
-          <w:hyperlink w:history="1" w:anchor="_Toc53">
-            <w:r>
-              <w:t xml:space="preserve">15. Riscos e limitações</w:t>
-            </w:r>
-            <w:r>
-              <w:tab/>
-            </w:r>
-            <w:r>
-              <w:fldChar w:fldCharType="begin" w:dirty="true"/>
-              <w:instrText xml:space="preserve">PAGEREF _Toc53 \h</w:instrText>
-              <w:fldChar w:fldCharType="separate"/>
-              <w:fldChar w:fldCharType="end"/>
-            </w:r>
-          </w:hyperlink>
-        </w:p>
-        <w:p>
-          <w:pPr>
-            <w:pStyle w:val="TOC1"/>
-            <w:tabs>
-              <w:tab w:val="right" w:pos="9026" w:leader="dot"/>
-            </w:tabs>
-          </w:pPr>
-          <w:hyperlink w:history="1" w:anchor="_Toc54">
-            <w:r>
-              <w:t xml:space="preserve">16. Roadmap</w:t>
-            </w:r>
-            <w:r>
-              <w:tab/>
-            </w:r>
-            <w:r>
-              <w:fldChar w:fldCharType="begin" w:dirty="true"/>
-              <w:instrText xml:space="preserve">PAGEREF _Toc54 \h</w:instrText>
-              <w:fldChar w:fldCharType="separate"/>
-              <w:fldChar w:fldCharType="end"/>
-            </w:r>
-          </w:hyperlink>
-        </w:p>
-        <w:p>
-          <w:pPr>
-            <w:pStyle w:val="TOC1"/>
-            <w:tabs>
-              <w:tab w:val="right" w:pos="9026" w:leader="dot"/>
-            </w:tabs>
-          </w:pPr>
-          <w:hyperlink w:history="1" w:anchor="_Toc55">
-            <w:r>
-              <w:t xml:space="preserve">Apêndice A. Estrutura de diretórios</w:t>
-            </w:r>
-            <w:r>
-              <w:tab/>
-            </w:r>
-            <w:r>
-              <w:fldChar w:fldCharType="begin" w:dirty="true"/>
-              <w:instrText xml:space="preserve">PAGEREF _Toc55 \h</w:instrText>
-              <w:fldChar w:fldCharType="separate"/>
-              <w:fldChar w:fldCharType="end"/>
-            </w:r>
-          </w:hyperlink>
-        </w:p>
-        <w:p>
-          <w:pPr>
-            <w:pStyle w:val="TOC1"/>
-            <w:tabs>
-              <w:tab w:val="right" w:pos="9026" w:leader="dot"/>
-            </w:tabs>
-          </w:pPr>
-          <w:hyperlink w:history="1" w:anchor="_Toc56">
-            <w:r>
-              <w:t xml:space="preserve">Apêndice B. Documentos relacionados</w:t>
-            </w:r>
-            <w:r>
-              <w:tab/>
-            </w:r>
-            <w:r>
-              <w:fldChar w:fldCharType="begin" w:dirty="true"/>
-              <w:instrText xml:space="preserve">PAGEREF _Toc56 \h</w:instrText>
-              <w:fldChar w:fldCharType="separate"/>
-              <w:fldChar w:fldCharType="end"/>
-            </w:r>
-          </w:hyperlink>
-        </w:p>
-        <w:p>
-          <w:pPr>
-            <w:pStyle w:val="TOC1"/>
-            <w:tabs>
-              <w:tab w:val="right" w:pos="9026" w:leader="dot"/>
-            </w:tabs>
-          </w:pPr>
-          <w:hyperlink w:history="1" w:anchor="_Toc57">
-            <w:r>
-              <w:t xml:space="preserve">Apêndice C. Diagramas ampliados</w:t>
-            </w:r>
-            <w:r>
-              <w:tab/>
-            </w:r>
-            <w:r>
-              <w:fldChar w:fldCharType="begin" w:dirty="true"/>
-              <w:instrText xml:space="preserve">PAGEREF _Toc57 \h</w:instrText>
-              <w:fldChar w:fldCharType="separate"/>
-              <w:fldChar w:fldCharType="end"/>
-            </w:r>
-          </w:hyperlink>
-        </w:p>
-        <w:p>
-          <w:pPr>
-            <w:pStyle w:val="TOC2"/>
-            <w:tabs>
-              <w:tab w:val="right" w:pos="9026" w:leader="dot"/>
-            </w:tabs>
-            <w:ind w:left="220"/>
-          </w:pPr>
-          <w:hyperlink w:history="1" w:anchor="_Toc58">
-            <w:r>
-              <w:t xml:space="preserve">C.1 Arquitetura completa</w:t>
-            </w:r>
-            <w:r>
-              <w:tab/>
-            </w:r>
-            <w:r>
-              <w:fldChar w:fldCharType="begin" w:dirty="true"/>
-              <w:instrText xml:space="preserve">PAGEREF _Toc58 \h</w:instrText>
-              <w:fldChar w:fldCharType="separate"/>
-              <w:fldChar w:fldCharType="end"/>
-            </w:r>
-          </w:hyperlink>
-        </w:p>
-        <w:p>
-          <w:pPr>
-            <w:pStyle w:val="TOC2"/>
-            <w:tabs>
-              <w:tab w:val="right" w:pos="9026" w:leader="dot"/>
-            </w:tabs>
-            <w:ind w:left="220"/>
-          </w:pPr>
-          <w:hyperlink w:history="1" w:anchor="_Toc59">
-            <w:r>
-              <w:t xml:space="preserve">C.2 Camadas do app iOS</w:t>
-            </w:r>
-            <w:r>
-              <w:tab/>
-            </w:r>
-            <w:r>
-              <w:fldChar w:fldCharType="begin" w:dirty="true"/>
-              <w:instrText xml:space="preserve">PAGEREF _Toc59 \h</w:instrText>
-              <w:fldChar w:fldCharType="separate"/>
-              <w:fldChar w:fldCharType="end"/>
-            </w:r>
-          </w:hyperlink>
-        </w:p>
-        <w:p>
-          <w:pPr>
-            <w:pStyle w:val="TOC2"/>
-            <w:tabs>
-              <w:tab w:val="right" w:pos="9026" w:leader="dot"/>
-            </w:tabs>
-            <w:ind w:left="220"/>
-          </w:pPr>
-          <w:hyperlink w:history="1" w:anchor="_Toc60">
-            <w:r>
-              <w:t xml:space="preserve">C.3 Modelo de dados do Core</w:t>
-            </w:r>
-            <w:r>
-              <w:tab/>
-            </w:r>
-            <w:r>
-              <w:fldChar w:fldCharType="begin" w:dirty="true"/>
-              <w:instrText xml:space="preserve">PAGEREF _Toc60 \h</w:instrText>
-              <w:fldChar w:fldCharType="separate"/>
-              <w:fldChar w:fldCharType="end"/>
-            </w:r>
-          </w:hyperlink>
-        </w:p>
-        <w:p>
-          <w:pPr>
-            <w:pStyle w:val="TOC2"/>
-            <w:tabs>
-              <w:tab w:val="right" w:pos="9026" w:leader="dot"/>
-            </w:tabs>
-            <w:ind w:left="220"/>
-          </w:pPr>
-          <w:hyperlink w:history="1" w:anchor="_Toc61">
-            <w:r>
-              <w:t xml:space="preserve">C.4 Compra no cartão e fatura</w:t>
-            </w:r>
-            <w:r>
-              <w:tab/>
-            </w:r>
-            <w:r>
-              <w:fldChar w:fldCharType="begin" w:dirty="true"/>
-              <w:instrText xml:space="preserve">PAGEREF _Toc61 \h</w:instrText>
-              <w:fldChar w:fldCharType="separate"/>
-              <w:fldChar w:fldCharType="end"/>
-            </w:r>
-          </w:hyperlink>
-        </w:p>
-        <w:p>
-          <w:r>
-            <w:fldChar w:fldCharType="end"/>
-          </w:r>
-        </w:p>
-      </w:sdtContent>
-    </w:sdt>
+    </w:p>
+    <w:p>
+      <w:pPr>
+        <w:spacing w:after="60" w:before="120"/>
+        <w:ind w:left="0"/>
+      </w:pPr>
+      <w:r>
+        <w:rPr>
+          <w:b/>
+          <w:bCs/>
+          <w:color w:val="14201D"/>
+          <w:sz w:val="22"/>
+          <w:szCs w:val="22"/>
+        </w:rPr>
+        <w:t xml:space="preserve">1. Introdução</w:t>
+      </w:r>
+    </w:p>
+    <w:p>
+      <w:pPr>
+        <w:spacing w:after="20" w:before="0"/>
+        <w:ind w:left="400"/>
+      </w:pPr>
+      <w:r>
+        <w:rPr>
+          <w:b w:val="false"/>
+          <w:bCs w:val="false"/>
+          <w:color w:val="5A6763"/>
+          <w:sz w:val="20"/>
+          <w:szCs w:val="20"/>
+        </w:rPr>
+        <w:t xml:space="preserve">1.1 Objetivo</w:t>
+      </w:r>
+    </w:p>
+    <w:p>
+      <w:pPr>
+        <w:spacing w:after="20" w:before="0"/>
+        <w:ind w:left="400"/>
+      </w:pPr>
+      <w:r>
+        <w:rPr>
+          <w:b w:val="false"/>
+          <w:bCs w:val="false"/>
+          <w:color w:val="5A6763"/>
+          <w:sz w:val="20"/>
+          <w:szCs w:val="20"/>
+        </w:rPr>
+        <w:t xml:space="preserve">1.2 Público e escopo</w:t>
+      </w:r>
+    </w:p>
+    <w:p>
+      <w:pPr>
+        <w:spacing w:after="20" w:before="0"/>
+        <w:ind w:left="400"/>
+      </w:pPr>
+      <w:r>
+        <w:rPr>
+          <w:b w:val="false"/>
+          <w:bCs w:val="false"/>
+          <w:color w:val="5A6763"/>
+          <w:sz w:val="20"/>
+          <w:szCs w:val="20"/>
+        </w:rPr>
+        <w:t xml:space="preserve">1.3 Glossário</w:t>
+      </w:r>
+    </w:p>
+    <w:p>
+      <w:pPr>
+        <w:spacing w:after="60" w:before="120"/>
+        <w:ind w:left="0"/>
+      </w:pPr>
+      <w:r>
+        <w:rPr>
+          <w:b/>
+          <w:bCs/>
+          <w:color w:val="14201D"/>
+          <w:sz w:val="22"/>
+          <w:szCs w:val="22"/>
+        </w:rPr>
+        <w:t xml:space="preserve">2. Visão geral da solução</w:t>
+      </w:r>
+    </w:p>
+    <w:p>
+      <w:pPr>
+        <w:spacing w:after="20" w:before="0"/>
+        <w:ind w:left="400"/>
+      </w:pPr>
+      <w:r>
+        <w:rPr>
+          <w:b w:val="false"/>
+          <w:bCs w:val="false"/>
+          <w:color w:val="5A6763"/>
+          <w:sz w:val="20"/>
+          <w:szCs w:val="20"/>
+        </w:rPr>
+        <w:t xml:space="preserve">2.1 Componentes e estado</w:t>
+      </w:r>
+    </w:p>
+    <w:p>
+      <w:pPr>
+        <w:spacing w:after="60" w:before="120"/>
+        <w:ind w:left="0"/>
+      </w:pPr>
+      <w:r>
+        <w:rPr>
+          <w:b/>
+          <w:bCs/>
+          <w:color w:val="14201D"/>
+          <w:sz w:val="22"/>
+          <w:szCs w:val="22"/>
+        </w:rPr>
+        <w:t xml:space="preserve">3. Requisitos funcionais</w:t>
+      </w:r>
+    </w:p>
+    <w:p>
+      <w:pPr>
+        <w:spacing w:after="60" w:before="120"/>
+        <w:ind w:left="0"/>
+      </w:pPr>
+      <w:r>
+        <w:rPr>
+          <w:b/>
+          <w:bCs/>
+          <w:color w:val="14201D"/>
+          <w:sz w:val="22"/>
+          <w:szCs w:val="22"/>
+        </w:rPr>
+        <w:t xml:space="preserve">4. Requisitos não funcionais</w:t>
+      </w:r>
+    </w:p>
+    <w:p>
+      <w:pPr>
+        <w:spacing w:after="60" w:before="120"/>
+        <w:ind w:left="0"/>
+      </w:pPr>
+      <w:r>
+        <w:rPr>
+          <w:b/>
+          <w:bCs/>
+          <w:color w:val="14201D"/>
+          <w:sz w:val="22"/>
+          <w:szCs w:val="22"/>
+        </w:rPr>
+        <w:t xml:space="preserve">5. Arquitetura</w:t>
+      </w:r>
+    </w:p>
+    <w:p>
+      <w:pPr>
+        <w:spacing w:after="20" w:before="0"/>
+        <w:ind w:left="400"/>
+      </w:pPr>
+      <w:r>
+        <w:rPr>
+          <w:b w:val="false"/>
+          <w:bCs w:val="false"/>
+          <w:color w:val="5A6763"/>
+          <w:sz w:val="20"/>
+          <w:szCs w:val="20"/>
+        </w:rPr>
+        <w:t xml:space="preserve">5.1 Camadas do app iOS</w:t>
+      </w:r>
+    </w:p>
+    <w:p>
+      <w:pPr>
+        <w:spacing w:after="20" w:before="0"/>
+        <w:ind w:left="400"/>
+      </w:pPr>
+      <w:r>
+        <w:rPr>
+          <w:b w:val="false"/>
+          <w:bCs w:val="false"/>
+          <w:color w:val="5A6763"/>
+          <w:sz w:val="20"/>
+          <w:szCs w:val="20"/>
+        </w:rPr>
+        <w:t xml:space="preserve">5.2 Decisões de arquitetura</w:t>
+      </w:r>
+    </w:p>
+    <w:p>
+      <w:pPr>
+        <w:spacing w:after="20" w:before="0"/>
+        <w:ind w:left="400"/>
+      </w:pPr>
+      <w:r>
+        <w:rPr>
+          <w:b w:val="false"/>
+          <w:bCs w:val="false"/>
+          <w:color w:val="5A6763"/>
+          <w:sz w:val="20"/>
+          <w:szCs w:val="20"/>
+        </w:rPr>
+        <w:t xml:space="preserve">5.3 Modelo de dados do Core</w:t>
+      </w:r>
+    </w:p>
+    <w:p>
+      <w:pPr>
+        <w:spacing w:after="60" w:before="120"/>
+        <w:ind w:left="0"/>
+      </w:pPr>
+      <w:r>
+        <w:rPr>
+          <w:b/>
+          <w:bCs/>
+          <w:color w:val="14201D"/>
+          <w:sz w:val="22"/>
+          <w:szCs w:val="22"/>
+        </w:rPr>
+        <w:t xml:space="preserve">6. App iOS</w:t>
+      </w:r>
+    </w:p>
+    <w:p>
+      <w:pPr>
+        <w:spacing w:after="20" w:before="0"/>
+        <w:ind w:left="400"/>
+      </w:pPr>
+      <w:r>
+        <w:rPr>
+          <w:b w:val="false"/>
+          <w:bCs w:val="false"/>
+          <w:color w:val="5A6763"/>
+          <w:sz w:val="20"/>
+          <w:szCs w:val="20"/>
+        </w:rPr>
+        <w:t xml:space="preserve">6.1 Motores do Core</w:t>
+      </w:r>
+    </w:p>
+    <w:p>
+      <w:pPr>
+        <w:spacing w:after="20" w:before="0"/>
+        <w:ind w:left="400"/>
+      </w:pPr>
+      <w:r>
+        <w:rPr>
+          <w:b w:val="false"/>
+          <w:bCs w:val="false"/>
+          <w:color w:val="5A6763"/>
+          <w:sz w:val="20"/>
+          <w:szCs w:val="20"/>
+        </w:rPr>
+        <w:t xml:space="preserve">6.2 Navegação e telas</w:t>
+      </w:r>
+    </w:p>
+    <w:p>
+      <w:pPr>
+        <w:spacing w:after="20" w:before="0"/>
+        <w:ind w:left="400"/>
+      </w:pPr>
+      <w:r>
+        <w:rPr>
+          <w:b w:val="false"/>
+          <w:bCs w:val="false"/>
+          <w:color w:val="5A6763"/>
+          <w:sz w:val="20"/>
+          <w:szCs w:val="20"/>
+        </w:rPr>
+        <w:t xml:space="preserve">6.3 Seletor de mês e atualização</w:t>
+      </w:r>
+    </w:p>
+    <w:p>
+      <w:pPr>
+        <w:spacing w:after="20" w:before="0"/>
+        <w:ind w:left="400"/>
+      </w:pPr>
+      <w:r>
+        <w:rPr>
+          <w:b w:val="false"/>
+          <w:bCs w:val="false"/>
+          <w:color w:val="5A6763"/>
+          <w:sz w:val="20"/>
+          <w:szCs w:val="20"/>
+        </w:rPr>
+        <w:t xml:space="preserve">6.4 Projeto e build</w:t>
+      </w:r>
+    </w:p>
+    <w:p>
+      <w:pPr>
+        <w:spacing w:after="60" w:before="120"/>
+        <w:ind w:left="0"/>
+      </w:pPr>
+      <w:r>
+        <w:rPr>
+          <w:b/>
+          <w:bCs/>
+          <w:color w:val="14201D"/>
+          <w:sz w:val="22"/>
+          <w:szCs w:val="22"/>
+        </w:rPr>
+        <w:t xml:space="preserve">7. Regras de negócio</w:t>
+      </w:r>
+    </w:p>
+    <w:p>
+      <w:pPr>
+        <w:spacing w:after="20" w:before="0"/>
+        <w:ind w:left="400"/>
+      </w:pPr>
+      <w:r>
+        <w:rPr>
+          <w:b w:val="false"/>
+          <w:bCs w:val="false"/>
+          <w:color w:val="5A6763"/>
+          <w:sz w:val="20"/>
+          <w:szCs w:val="20"/>
+        </w:rPr>
+        <w:t xml:space="preserve">7.1 Cartão de crédito e fatura</w:t>
+      </w:r>
+    </w:p>
+    <w:p>
+      <w:pPr>
+        <w:spacing w:after="20" w:before="0"/>
+        <w:ind w:left="400"/>
+      </w:pPr>
+      <w:r>
+        <w:rPr>
+          <w:b w:val="false"/>
+          <w:bCs w:val="false"/>
+          <w:color w:val="5A6763"/>
+          <w:sz w:val="20"/>
+          <w:szCs w:val="20"/>
+        </w:rPr>
+        <w:t xml:space="preserve">7.2 Parcelas e recorrência</w:t>
+      </w:r>
+    </w:p>
+    <w:p>
+      <w:pPr>
+        <w:spacing w:after="20" w:before="0"/>
+        <w:ind w:left="400"/>
+      </w:pPr>
+      <w:r>
+        <w:rPr>
+          <w:b w:val="false"/>
+          <w:bCs w:val="false"/>
+          <w:color w:val="5A6763"/>
+          <w:sz w:val="20"/>
+          <w:szCs w:val="20"/>
+        </w:rPr>
+        <w:t xml:space="preserve">7.3 Orçamento</w:t>
+      </w:r>
+    </w:p>
+    <w:p>
+      <w:pPr>
+        <w:spacing w:after="20" w:before="0"/>
+        <w:ind w:left="400"/>
+      </w:pPr>
+      <w:r>
+        <w:rPr>
+          <w:b w:val="false"/>
+          <w:bCs w:val="false"/>
+          <w:color w:val="5A6763"/>
+          <w:sz w:val="20"/>
+          <w:szCs w:val="20"/>
+        </w:rPr>
+        <w:t xml:space="preserve">7.4 Família</w:t>
+      </w:r>
+    </w:p>
+    <w:p>
+      <w:pPr>
+        <w:spacing w:after="20" w:before="0"/>
+        <w:ind w:left="400"/>
+      </w:pPr>
+      <w:r>
+        <w:rPr>
+          <w:b w:val="false"/>
+          <w:bCs w:val="false"/>
+          <w:color w:val="5A6763"/>
+          <w:sz w:val="20"/>
+          <w:szCs w:val="20"/>
+        </w:rPr>
+        <w:t xml:space="preserve">7.5 Dívidas, metas e insights</w:t>
+      </w:r>
+    </w:p>
+    <w:p>
+      <w:pPr>
+        <w:spacing w:after="20" w:before="0"/>
+        <w:ind w:left="400"/>
+      </w:pPr>
+      <w:r>
+        <w:rPr>
+          <w:b w:val="false"/>
+          <w:bCs w:val="false"/>
+          <w:color w:val="5A6763"/>
+          <w:sz w:val="20"/>
+          <w:szCs w:val="20"/>
+        </w:rPr>
+        <w:t xml:space="preserve">7.6 Imposto de Renda</w:t>
+      </w:r>
+    </w:p>
+    <w:p>
+      <w:pPr>
+        <w:spacing w:after="60" w:before="120"/>
+        <w:ind w:left="0"/>
+      </w:pPr>
+      <w:r>
+        <w:rPr>
+          <w:b/>
+          <w:bCs/>
+          <w:color w:val="14201D"/>
+          <w:sz w:val="22"/>
+          <w:szCs w:val="22"/>
+        </w:rPr>
+        <w:t xml:space="preserve">8. Versão web</w:t>
+      </w:r>
+    </w:p>
+    <w:p>
+      <w:pPr>
+        <w:spacing w:after="20" w:before="0"/>
+        <w:ind w:left="400"/>
+      </w:pPr>
+      <w:r>
+        <w:rPr>
+          <w:b w:val="false"/>
+          <w:bCs w:val="false"/>
+          <w:color w:val="5A6763"/>
+          <w:sz w:val="20"/>
+          <w:szCs w:val="20"/>
+        </w:rPr>
+        <w:t xml:space="preserve">8.1 Stack e estrutura</w:t>
+      </w:r>
+    </w:p>
+    <w:p>
+      <w:pPr>
+        <w:spacing w:after="20" w:before="0"/>
+        <w:ind w:left="400"/>
+      </w:pPr>
+      <w:r>
+        <w:rPr>
+          <w:b w:val="false"/>
+          <w:bCs w:val="false"/>
+          <w:color w:val="5A6763"/>
+          <w:sz w:val="20"/>
+          <w:szCs w:val="20"/>
+        </w:rPr>
+        <w:t xml:space="preserve">8.2 Paridade com o app iOS</w:t>
+      </w:r>
+    </w:p>
+    <w:p>
+      <w:pPr>
+        <w:spacing w:after="20" w:before="0"/>
+        <w:ind w:left="400"/>
+      </w:pPr>
+      <w:r>
+        <w:rPr>
+          <w:b w:val="false"/>
+          <w:bCs w:val="false"/>
+          <w:color w:val="5A6763"/>
+          <w:sz w:val="20"/>
+          <w:szCs w:val="20"/>
+        </w:rPr>
+        <w:t xml:space="preserve">8.3 Telas</w:t>
+      </w:r>
+    </w:p>
+    <w:p>
+      <w:pPr>
+        <w:spacing w:after="20" w:before="0"/>
+        <w:ind w:left="400"/>
+      </w:pPr>
+      <w:r>
+        <w:rPr>
+          <w:b w:val="false"/>
+          <w:bCs w:val="false"/>
+          <w:color w:val="5A6763"/>
+          <w:sz w:val="20"/>
+          <w:szCs w:val="20"/>
+        </w:rPr>
+        <w:t xml:space="preserve">8.4 Fora da versão web</w:t>
+      </w:r>
+    </w:p>
+    <w:p>
+      <w:pPr>
+        <w:spacing w:after="60" w:before="120"/>
+        <w:ind w:left="0"/>
+      </w:pPr>
+      <w:r>
+        <w:rPr>
+          <w:b/>
+          <w:bCs/>
+          <w:color w:val="14201D"/>
+          <w:sz w:val="22"/>
+          <w:szCs w:val="22"/>
+        </w:rPr>
+        <w:t xml:space="preserve">9. Backend</w:t>
+      </w:r>
+    </w:p>
+    <w:p>
+      <w:pPr>
+        <w:spacing w:after="20" w:before="0"/>
+        <w:ind w:left="400"/>
+      </w:pPr>
+      <w:r>
+        <w:rPr>
+          <w:b w:val="false"/>
+          <w:bCs w:val="false"/>
+          <w:color w:val="5A6763"/>
+          <w:sz w:val="20"/>
+          <w:szCs w:val="20"/>
+        </w:rPr>
+        <w:t xml:space="preserve">9.1 Endpoints da API</w:t>
+      </w:r>
+    </w:p>
+    <w:p>
+      <w:pPr>
+        <w:spacing w:after="20" w:before="0"/>
+        <w:ind w:left="400"/>
+      </w:pPr>
+      <w:r>
+        <w:rPr>
+          <w:b w:val="false"/>
+          <w:bCs w:val="false"/>
+          <w:color w:val="5A6763"/>
+          <w:sz w:val="20"/>
+          <w:szCs w:val="20"/>
+        </w:rPr>
+        <w:t xml:space="preserve">9.2 Modelo do banco</w:t>
+      </w:r>
+    </w:p>
+    <w:p>
+      <w:pPr>
+        <w:spacing w:after="20" w:before="0"/>
+        <w:ind w:left="400"/>
+      </w:pPr>
+      <w:r>
+        <w:rPr>
+          <w:b w:val="false"/>
+          <w:bCs w:val="false"/>
+          <w:color w:val="5A6763"/>
+          <w:sz w:val="20"/>
+          <w:szCs w:val="20"/>
+        </w:rPr>
+        <w:t xml:space="preserve">9.3 Migrações</w:t>
+      </w:r>
+    </w:p>
+    <w:p>
+      <w:pPr>
+        <w:spacing w:after="20" w:before="0"/>
+        <w:ind w:left="400"/>
+      </w:pPr>
+      <w:r>
+        <w:rPr>
+          <w:b w:val="false"/>
+          <w:bCs w:val="false"/>
+          <w:color w:val="5A6763"/>
+          <w:sz w:val="20"/>
+          <w:szCs w:val="20"/>
+        </w:rPr>
+        <w:t xml:space="preserve">9.4 Docker Compose</w:t>
+      </w:r>
+    </w:p>
+    <w:p>
+      <w:pPr>
+        <w:spacing w:after="20" w:before="0"/>
+        <w:ind w:left="400"/>
+      </w:pPr>
+      <w:r>
+        <w:rPr>
+          <w:b w:val="false"/>
+          <w:bCs w:val="false"/>
+          <w:color w:val="5A6763"/>
+          <w:sz w:val="20"/>
+          <w:szCs w:val="20"/>
+        </w:rPr>
+        <w:t xml:space="preserve">9.5 Variáveis de ambiente</w:t>
+      </w:r>
+    </w:p>
+    <w:p>
+      <w:pPr>
+        <w:spacing w:after="60" w:before="120"/>
+        <w:ind w:left="0"/>
+      </w:pPr>
+      <w:r>
+        <w:rPr>
+          <w:b/>
+          <w:bCs/>
+          <w:color w:val="14201D"/>
+          <w:sz w:val="22"/>
+          <w:szCs w:val="22"/>
+        </w:rPr>
+        <w:t xml:space="preserve">10. Sincronização</w:t>
+      </w:r>
+    </w:p>
+    <w:p>
+      <w:pPr>
+        <w:spacing w:after="20" w:before="0"/>
+        <w:ind w:left="400"/>
+      </w:pPr>
+      <w:r>
+        <w:rPr>
+          <w:b w:val="false"/>
+          <w:bCs w:val="false"/>
+          <w:color w:val="5A6763"/>
+          <w:sz w:val="20"/>
+          <w:szCs w:val="20"/>
+        </w:rPr>
+        <w:t xml:space="preserve">10.1 Regra de conflito</w:t>
+      </w:r>
+    </w:p>
+    <w:p>
+      <w:pPr>
+        <w:spacing w:after="20" w:before="0"/>
+        <w:ind w:left="400"/>
+      </w:pPr>
+      <w:r>
+        <w:rPr>
+          <w:b w:val="false"/>
+          <w:bCs w:val="false"/>
+          <w:color w:val="5A6763"/>
+          <w:sz w:val="20"/>
+          <w:szCs w:val="20"/>
+        </w:rPr>
+        <w:t xml:space="preserve">10.2 Pontos de atenção para o cliente</w:t>
+      </w:r>
+    </w:p>
+    <w:p>
+      <w:pPr>
+        <w:spacing w:after="60" w:before="120"/>
+        <w:ind w:left="0"/>
+      </w:pPr>
+      <w:r>
+        <w:rPr>
+          <w:b/>
+          <w:bCs/>
+          <w:color w:val="14201D"/>
+          <w:sz w:val="22"/>
+          <w:szCs w:val="22"/>
+        </w:rPr>
+        <w:t xml:space="preserve">11. Design</w:t>
+      </w:r>
+    </w:p>
+    <w:p>
+      <w:pPr>
+        <w:spacing w:after="60" w:before="120"/>
+        <w:ind w:left="0"/>
+      </w:pPr>
+      <w:r>
+        <w:rPr>
+          <w:b/>
+          <w:bCs/>
+          <w:color w:val="14201D"/>
+          <w:sz w:val="22"/>
+          <w:szCs w:val="22"/>
+        </w:rPr>
+        <w:t xml:space="preserve">12. Qualidade e testes</w:t>
+      </w:r>
+    </w:p>
+    <w:p>
+      <w:pPr>
+        <w:spacing w:after="20" w:before="0"/>
+        <w:ind w:left="400"/>
+      </w:pPr>
+      <w:r>
+        <w:rPr>
+          <w:b w:val="false"/>
+          <w:bCs w:val="false"/>
+          <w:color w:val="5A6763"/>
+          <w:sz w:val="20"/>
+          <w:szCs w:val="20"/>
+        </w:rPr>
+        <w:t xml:space="preserve">12.1 Estratégia</w:t>
+      </w:r>
+    </w:p>
+    <w:p>
+      <w:pPr>
+        <w:spacing w:after="20" w:before="0"/>
+        <w:ind w:left="400"/>
+      </w:pPr>
+      <w:r>
+        <w:rPr>
+          <w:b w:val="false"/>
+          <w:bCs w:val="false"/>
+          <w:color w:val="5A6763"/>
+          <w:sz w:val="20"/>
+          <w:szCs w:val="20"/>
+        </w:rPr>
+        <w:t xml:space="preserve">12.2 O que não foi verificado</w:t>
+      </w:r>
+    </w:p>
+    <w:p>
+      <w:pPr>
+        <w:spacing w:after="60" w:before="120"/>
+        <w:ind w:left="0"/>
+      </w:pPr>
+      <w:r>
+        <w:rPr>
+          <w:b/>
+          <w:bCs/>
+          <w:color w:val="14201D"/>
+          <w:sz w:val="22"/>
+          <w:szCs w:val="22"/>
+        </w:rPr>
+        <w:t xml:space="preserve">13. Operação</w:t>
+      </w:r>
+    </w:p>
+    <w:p>
+      <w:pPr>
+        <w:spacing w:after="20" w:before="0"/>
+        <w:ind w:left="400"/>
+      </w:pPr>
+      <w:r>
+        <w:rPr>
+          <w:b w:val="false"/>
+          <w:bCs w:val="false"/>
+          <w:color w:val="5A6763"/>
+          <w:sz w:val="20"/>
+          <w:szCs w:val="20"/>
+        </w:rPr>
+        <w:t xml:space="preserve">13.1 Subir o ambiente</w:t>
+      </w:r>
+    </w:p>
+    <w:p>
+      <w:pPr>
+        <w:spacing w:after="20" w:before="0"/>
+        <w:ind w:left="400"/>
+      </w:pPr>
+      <w:r>
+        <w:rPr>
+          <w:b w:val="false"/>
+          <w:bCs w:val="false"/>
+          <w:color w:val="5A6763"/>
+          <w:sz w:val="20"/>
+          <w:szCs w:val="20"/>
+        </w:rPr>
+        <w:t xml:space="preserve">13.2 Acesso pela internet</w:t>
+      </w:r>
+    </w:p>
+    <w:p>
+      <w:pPr>
+        <w:spacing w:after="20" w:before="0"/>
+        <w:ind w:left="400"/>
+      </w:pPr>
+      <w:r>
+        <w:rPr>
+          <w:b w:val="false"/>
+          <w:bCs w:val="false"/>
+          <w:color w:val="5A6763"/>
+          <w:sz w:val="20"/>
+          <w:szCs w:val="20"/>
+        </w:rPr>
+        <w:t xml:space="preserve">13.3 Backup e restauração</w:t>
+      </w:r>
+    </w:p>
+    <w:p>
+      <w:pPr>
+        <w:spacing w:after="20" w:before="0"/>
+        <w:ind w:left="400"/>
+      </w:pPr>
+      <w:r>
+        <w:rPr>
+          <w:b w:val="false"/>
+          <w:bCs w:val="false"/>
+          <w:color w:val="5A6763"/>
+          <w:sz w:val="20"/>
+          <w:szCs w:val="20"/>
+        </w:rPr>
+        <w:t xml:space="preserve">13.4 Painel de agentes</w:t>
+      </w:r>
+    </w:p>
+    <w:p>
+      <w:pPr>
+        <w:spacing w:after="20" w:before="0"/>
+        <w:ind w:left="400"/>
+      </w:pPr>
+      <w:r>
+        <w:rPr>
+          <w:b w:val="false"/>
+          <w:bCs w:val="false"/>
+          <w:color w:val="5A6763"/>
+          <w:sz w:val="20"/>
+          <w:szCs w:val="20"/>
+        </w:rPr>
+        <w:t xml:space="preserve">13.5 Instalação em iPhone</w:t>
+      </w:r>
+    </w:p>
+    <w:p>
+      <w:pPr>
+        <w:spacing w:after="20" w:before="0"/>
+        <w:ind w:left="400"/>
+      </w:pPr>
+      <w:r>
+        <w:rPr>
+          <w:b w:val="false"/>
+          <w:bCs w:val="false"/>
+          <w:color w:val="5A6763"/>
+          <w:sz w:val="20"/>
+          <w:szCs w:val="20"/>
+        </w:rPr>
+        <w:t xml:space="preserve">13.6 Ferramentas de apoio</w:t>
+      </w:r>
+    </w:p>
+    <w:p>
+      <w:pPr>
+        <w:spacing w:after="60" w:before="120"/>
+        <w:ind w:left="0"/>
+      </w:pPr>
+      <w:r>
+        <w:rPr>
+          <w:b/>
+          <w:bCs/>
+          <w:color w:val="14201D"/>
+          <w:sz w:val="22"/>
+          <w:szCs w:val="22"/>
+        </w:rPr>
+        <w:t xml:space="preserve">14. Segurança e privacidade</w:t>
+      </w:r>
+    </w:p>
+    <w:p>
+      <w:pPr>
+        <w:spacing w:after="20" w:before="0"/>
+        <w:ind w:left="400"/>
+      </w:pPr>
+      <w:r>
+        <w:rPr>
+          <w:b w:val="false"/>
+          <w:bCs w:val="false"/>
+          <w:color w:val="5A6763"/>
+          <w:sz w:val="20"/>
+          <w:szCs w:val="20"/>
+        </w:rPr>
+        <w:t xml:space="preserve">14.1 LGPD</w:t>
+      </w:r>
+    </w:p>
+    <w:p>
+      <w:pPr>
+        <w:spacing w:after="60" w:before="120"/>
+        <w:ind w:left="0"/>
+      </w:pPr>
+      <w:r>
+        <w:rPr>
+          <w:b/>
+          <w:bCs/>
+          <w:color w:val="14201D"/>
+          <w:sz w:val="22"/>
+          <w:szCs w:val="22"/>
+        </w:rPr>
+        <w:t xml:space="preserve">15. Riscos e limitações</w:t>
+      </w:r>
+    </w:p>
+    <w:p>
+      <w:pPr>
+        <w:spacing w:after="60" w:before="120"/>
+        <w:ind w:left="0"/>
+      </w:pPr>
+      <w:r>
+        <w:rPr>
+          <w:b/>
+          <w:bCs/>
+          <w:color w:val="14201D"/>
+          <w:sz w:val="22"/>
+          <w:szCs w:val="22"/>
+        </w:rPr>
+        <w:t xml:space="preserve">16. Roadmap</w:t>
+      </w:r>
+    </w:p>
+    <w:p>
+      <w:pPr>
+        <w:spacing w:after="60" w:before="120"/>
+        <w:ind w:left="0"/>
+      </w:pPr>
+      <w:r>
+        <w:rPr>
+          <w:b/>
+          <w:bCs/>
+          <w:color w:val="14201D"/>
+          <w:sz w:val="22"/>
+          <w:szCs w:val="22"/>
+        </w:rPr>
+        <w:t xml:space="preserve">Apêndice A. Estrutura de diretórios</w:t>
+      </w:r>
+    </w:p>
+    <w:p>
+      <w:pPr>
+        <w:spacing w:after="60" w:before="120"/>
+        <w:ind w:left="0"/>
+      </w:pPr>
+      <w:r>
+        <w:rPr>
+          <w:b/>
+          <w:bCs/>
+          <w:color w:val="14201D"/>
+          <w:sz w:val="22"/>
+          <w:szCs w:val="22"/>
+        </w:rPr>
+        <w:t xml:space="preserve">Apêndice B. Documentos relacionados</w:t>
+      </w:r>
+    </w:p>
+    <w:p>
+      <w:pPr>
+        <w:spacing w:after="60" w:before="120"/>
+        <w:ind w:left="0"/>
+      </w:pPr>
+      <w:r>
+        <w:rPr>
+          <w:b/>
+          <w:bCs/>
+          <w:color w:val="14201D"/>
+          <w:sz w:val="22"/>
+          <w:szCs w:val="22"/>
+        </w:rPr>
+        <w:t xml:space="preserve">Apêndice C. Diagramas ampliados</w:t>
+      </w:r>
+    </w:p>
+    <w:p>
+      <w:pPr>
+        <w:spacing w:after="20" w:before="0"/>
+        <w:ind w:left="400"/>
+      </w:pPr>
+      <w:r>
+        <w:rPr>
+          <w:b w:val="false"/>
+          <w:bCs w:val="false"/>
+          <w:color w:val="5A6763"/>
+          <w:sz w:val="20"/>
+          <w:szCs w:val="20"/>
+        </w:rPr>
+        <w:t xml:space="preserve">C.1 Arquitetura completa</w:t>
+      </w:r>
+    </w:p>
+    <w:p>
+      <w:pPr>
+        <w:spacing w:after="20" w:before="0"/>
+        <w:ind w:left="400"/>
+      </w:pPr>
+      <w:r>
+        <w:rPr>
+          <w:b w:val="false"/>
+          <w:bCs w:val="false"/>
+          <w:color w:val="5A6763"/>
+          <w:sz w:val="20"/>
+          <w:szCs w:val="20"/>
+        </w:rPr>
+        <w:t xml:space="preserve">C.2 Camadas do app iOS</w:t>
+      </w:r>
+    </w:p>
+    <w:p>
+      <w:pPr>
+        <w:spacing w:after="20" w:before="0"/>
+        <w:ind w:left="400"/>
+      </w:pPr>
+      <w:r>
+        <w:rPr>
+          <w:b w:val="false"/>
+          <w:bCs w:val="false"/>
+          <w:color w:val="5A6763"/>
+          <w:sz w:val="20"/>
+          <w:szCs w:val="20"/>
+        </w:rPr>
+        <w:t xml:space="preserve">C.3 Modelo de dados do Core</w:t>
+      </w:r>
+    </w:p>
+    <w:p>
+      <w:pPr>
+        <w:spacing w:after="20" w:before="0"/>
+        <w:ind w:left="400"/>
+      </w:pPr>
+      <w:r>
+        <w:rPr>
+          <w:b w:val="false"/>
+          <w:bCs w:val="false"/>
+          <w:color w:val="5A6763"/>
+          <w:sz w:val="20"/>
+          <w:szCs w:val="20"/>
+        </w:rPr>
+        <w:t xml:space="preserve">C.4 Compra no cartão e fatura</w:t>
+      </w:r>
+    </w:p>
     <w:p>
       <w:pPr>
         <w:pStyle w:val="Heading1"/>
         <w:pageBreakBefore/>
       </w:pPr>
-      <w:bookmarkStart w:name="_Toc2" w:id="2"/>
       <w:r>
         <w:t xml:space="preserve">1. Introdução</w:t>
       </w:r>
-      <w:bookmarkEnd w:id="2"/>
     </w:p>
     <w:p>
       <w:pPr>
         <w:pStyle w:val="Heading2"/>
       </w:pPr>
-      <w:bookmarkStart w:name="_Toc3" w:id="3"/>
       <w:r>
         <w:t xml:space="preserve">1.1 Objetivo</w:t>
       </w:r>
-      <w:bookmarkEnd w:id="3"/>
     </w:p>
     <w:p>
       <w:pPr>
@@ -1908,11 +1469,9 @@
       <w:pPr>
         <w:pStyle w:val="Heading2"/>
       </w:pPr>
-      <w:bookmarkStart w:name="_Toc4" w:id="4"/>
       <w:r>
         <w:t xml:space="preserve">1.2 Público e escopo</w:t>
       </w:r>
-      <w:bookmarkEnd w:id="4"/>
     </w:p>
     <w:p>
       <w:pPr>
@@ -1998,11 +1557,9 @@
       <w:pPr>
         <w:pStyle w:val="Heading2"/>
       </w:pPr>
-      <w:bookmarkStart w:name="_Toc5" w:id="5"/>
       <w:r>
         <w:t xml:space="preserve">1.3 Glossário</w:t>
       </w:r>
-      <w:bookmarkEnd w:id="5"/>
     </w:p>
     <w:tbl>
       <w:tblPr>
@@ -2633,11 +2190,9 @@
         <w:pStyle w:val="Heading1"/>
         <w:pageBreakBefore/>
       </w:pPr>
-      <w:bookmarkStart w:name="_Toc6" w:id="6"/>
       <w:r>
         <w:t xml:space="preserve">2. Visão geral da solução</w:t>
       </w:r>
-      <w:bookmarkEnd w:id="6"/>
     </w:p>
     <w:p>
       <w:pPr>
@@ -2714,11 +2269,9 @@
       <w:pPr>
         <w:pStyle w:val="Heading2"/>
       </w:pPr>
-      <w:bookmarkStart w:name="_Toc7" w:id="7"/>
       <w:r>
         <w:t xml:space="preserve">2.1 Componentes e estado</w:t>
       </w:r>
-      <w:bookmarkEnd w:id="7"/>
     </w:p>
     <w:tbl>
       <w:tblPr>
@@ -3859,11 +3412,9 @@
         <w:pStyle w:val="Heading1"/>
         <w:pageBreakBefore/>
       </w:pPr>
-      <w:bookmarkStart w:name="_Toc8" w:id="8"/>
       <w:r>
         <w:t xml:space="preserve">3. Requisitos funcionais</w:t>
       </w:r>
-      <w:bookmarkEnd w:id="8"/>
     </w:p>
     <w:p>
       <w:pPr>
@@ -6300,11 +5851,9 @@
         <w:pStyle w:val="Heading1"/>
         <w:pageBreakBefore/>
       </w:pPr>
-      <w:bookmarkStart w:name="_Toc9" w:id="9"/>
       <w:r>
         <w:t xml:space="preserve">4. Requisitos não funcionais</w:t>
       </w:r>
-      <w:bookmarkEnd w:id="9"/>
     </w:p>
     <w:tbl>
       <w:tblPr>
@@ -7382,21 +6931,17 @@
         <w:pStyle w:val="Heading1"/>
         <w:pageBreakBefore/>
       </w:pPr>
-      <w:bookmarkStart w:name="_Toc10" w:id="10"/>
       <w:r>
         <w:t xml:space="preserve">5. Arquitetura</w:t>
       </w:r>
-      <w:bookmarkEnd w:id="10"/>
     </w:p>
     <w:p>
       <w:pPr>
         <w:pStyle w:val="Heading2"/>
       </w:pPr>
-      <w:bookmarkStart w:name="_Toc11" w:id="11"/>
       <w:r>
         <w:t xml:space="preserve">5.1 Camadas do app iOS</w:t>
       </w:r>
-      <w:bookmarkEnd w:id="11"/>
     </w:p>
     <w:p>
       <w:pPr>
@@ -8121,11 +7666,9 @@
       <w:pPr>
         <w:pStyle w:val="Heading2"/>
       </w:pPr>
-      <w:bookmarkStart w:name="_Toc12" w:id="12"/>
       <w:r>
         <w:t xml:space="preserve">5.2 Decisões de arquitetura</w:t>
       </w:r>
-      <w:bookmarkEnd w:id="12"/>
     </w:p>
     <w:tbl>
       <w:tblPr>
@@ -8979,11 +8522,9 @@
       <w:pPr>
         <w:pStyle w:val="Heading2"/>
       </w:pPr>
-      <w:bookmarkStart w:name="_Toc13" w:id="13"/>
       <w:r>
         <w:t xml:space="preserve">5.3 Modelo de dados do Core</w:t>
       </w:r>
-      <w:bookmarkEnd w:id="13"/>
     </w:p>
     <w:p>
       <w:pPr>
@@ -9653,21 +9194,17 @@
         <w:pStyle w:val="Heading1"/>
         <w:pageBreakBefore/>
       </w:pPr>
-      <w:bookmarkStart w:name="_Toc14" w:id="14"/>
       <w:r>
         <w:t xml:space="preserve">6. App iOS</w:t>
       </w:r>
-      <w:bookmarkEnd w:id="14"/>
     </w:p>
     <w:p>
       <w:pPr>
         <w:pStyle w:val="Heading2"/>
       </w:pPr>
-      <w:bookmarkStart w:name="_Toc15" w:id="15"/>
       <w:r>
         <w:t xml:space="preserve">6.1 Motores do Core</w:t>
       </w:r>
-      <w:bookmarkEnd w:id="15"/>
     </w:p>
     <w:tbl>
       <w:tblPr>
@@ -10684,11 +10221,9 @@
       <w:pPr>
         <w:pStyle w:val="Heading2"/>
       </w:pPr>
-      <w:bookmarkStart w:name="_Toc16" w:id="16"/>
       <w:r>
         <w:t xml:space="preserve">6.2 Navegação e telas</w:t>
       </w:r>
-      <w:bookmarkEnd w:id="16"/>
     </w:p>
     <w:p>
       <w:pPr>
@@ -11243,11 +10778,9 @@
       <w:pPr>
         <w:pStyle w:val="Heading2"/>
       </w:pPr>
-      <w:bookmarkStart w:name="_Toc17" w:id="17"/>
       <w:r>
         <w:t xml:space="preserve">6.3 Seletor de mês e atualização</w:t>
       </w:r>
-      <w:bookmarkEnd w:id="17"/>
     </w:p>
     <w:p>
       <w:pPr>
@@ -11341,11 +10874,9 @@
       <w:pPr>
         <w:pStyle w:val="Heading2"/>
       </w:pPr>
-      <w:bookmarkStart w:name="_Toc18" w:id="18"/>
       <w:r>
         <w:t xml:space="preserve">6.4 Projeto e build</w:t>
       </w:r>
-      <w:bookmarkEnd w:id="18"/>
     </w:p>
     <w:tbl>
       <w:tblPr>
@@ -12445,21 +11976,17 @@
         <w:pStyle w:val="Heading1"/>
         <w:pageBreakBefore/>
       </w:pPr>
-      <w:bookmarkStart w:name="_Toc19" w:id="19"/>
       <w:r>
         <w:t xml:space="preserve">7. Regras de negócio</w:t>
       </w:r>
-      <w:bookmarkEnd w:id="19"/>
     </w:p>
     <w:p>
       <w:pPr>
         <w:pStyle w:val="Heading2"/>
       </w:pPr>
-      <w:bookmarkStart w:name="_Toc20" w:id="20"/>
       <w:r>
         <w:t xml:space="preserve">7.1 Cartão de crédito e fatura</w:t>
       </w:r>
-      <w:bookmarkEnd w:id="20"/>
     </w:p>
     <w:p>
       <w:pPr>
@@ -12623,11 +12150,9 @@
       <w:pPr>
         <w:pStyle w:val="Heading2"/>
       </w:pPr>
-      <w:bookmarkStart w:name="_Toc21" w:id="21"/>
       <w:r>
         <w:t xml:space="preserve">7.2 Parcelas e recorrência</w:t>
       </w:r>
-      <w:bookmarkEnd w:id="21"/>
     </w:p>
     <w:p>
       <w:pPr>
@@ -12672,11 +12197,9 @@
       <w:pPr>
         <w:pStyle w:val="Heading2"/>
       </w:pPr>
-      <w:bookmarkStart w:name="_Toc22" w:id="22"/>
       <w:r>
         <w:t xml:space="preserve">7.3 Orçamento</w:t>
       </w:r>
-      <w:bookmarkEnd w:id="22"/>
     </w:p>
     <w:p>
       <w:pPr>
@@ -12708,11 +12231,9 @@
       <w:pPr>
         <w:pStyle w:val="Heading2"/>
       </w:pPr>
-      <w:bookmarkStart w:name="_Toc23" w:id="23"/>
       <w:r>
         <w:t xml:space="preserve">7.4 Família</w:t>
       </w:r>
-      <w:bookmarkEnd w:id="23"/>
     </w:p>
     <w:p>
       <w:pPr>
@@ -12770,11 +12291,9 @@
       <w:pPr>
         <w:pStyle w:val="Heading2"/>
       </w:pPr>
-      <w:bookmarkStart w:name="_Toc24" w:id="24"/>
       <w:r>
         <w:t xml:space="preserve">7.5 Dívidas, metas e insights</w:t>
       </w:r>
-      <w:bookmarkEnd w:id="24"/>
     </w:p>
     <w:p>
       <w:pPr>
@@ -12819,11 +12338,9 @@
       <w:pPr>
         <w:pStyle w:val="Heading2"/>
       </w:pPr>
-      <w:bookmarkStart w:name="_Toc25" w:id="25"/>
       <w:r>
         <w:t xml:space="preserve">7.6 Imposto de Renda</w:t>
       </w:r>
-      <w:bookmarkEnd w:id="25"/>
     </w:p>
     <w:p>
       <w:pPr>
@@ -12838,21 +12355,17 @@
         <w:pStyle w:val="Heading1"/>
         <w:pageBreakBefore/>
       </w:pPr>
-      <w:bookmarkStart w:name="_Toc26" w:id="26"/>
       <w:r>
         <w:t xml:space="preserve">8. Versão web</w:t>
       </w:r>
-      <w:bookmarkEnd w:id="26"/>
     </w:p>
     <w:p>
       <w:pPr>
         <w:pStyle w:val="Heading2"/>
       </w:pPr>
-      <w:bookmarkStart w:name="_Toc27" w:id="27"/>
       <w:r>
         <w:t xml:space="preserve">8.1 Stack e estrutura</w:t>
       </w:r>
-      <w:bookmarkEnd w:id="27"/>
     </w:p>
     <w:p>
       <w:pPr>
@@ -12982,11 +12495,9 @@
       <w:pPr>
         <w:pStyle w:val="Heading2"/>
       </w:pPr>
-      <w:bookmarkStart w:name="_Toc28" w:id="28"/>
       <w:r>
         <w:t xml:space="preserve">8.2 Paridade com o app iOS</w:t>
       </w:r>
-      <w:bookmarkEnd w:id="28"/>
     </w:p>
     <w:p>
       <w:pPr>
@@ -13024,11 +12535,9 @@
       <w:pPr>
         <w:pStyle w:val="Heading2"/>
       </w:pPr>
-      <w:bookmarkStart w:name="_Toc29" w:id="29"/>
       <w:r>
         <w:t xml:space="preserve">8.3 Telas</w:t>
       </w:r>
-      <w:bookmarkEnd w:id="29"/>
     </w:p>
     <w:p>
       <w:pPr>
@@ -13042,11 +12551,9 @@
       <w:pPr>
         <w:pStyle w:val="Heading2"/>
       </w:pPr>
-      <w:bookmarkStart w:name="_Toc30" w:id="30"/>
       <w:r>
         <w:t xml:space="preserve">8.4 Fora da versão web</w:t>
       </w:r>
-      <w:bookmarkEnd w:id="30"/>
     </w:p>
     <w:p>
       <w:pPr>
@@ -13061,21 +12568,17 @@
         <w:pStyle w:val="Heading1"/>
         <w:pageBreakBefore/>
       </w:pPr>
-      <w:bookmarkStart w:name="_Toc31" w:id="31"/>
       <w:r>
         <w:t xml:space="preserve">9. Backend</w:t>
       </w:r>
-      <w:bookmarkEnd w:id="31"/>
     </w:p>
     <w:p>
       <w:pPr>
         <w:pStyle w:val="Heading2"/>
       </w:pPr>
-      <w:bookmarkStart w:name="_Toc32" w:id="32"/>
       <w:r>
         <w:t xml:space="preserve">9.1 Endpoints da API</w:t>
       </w:r>
-      <w:bookmarkEnd w:id="32"/>
     </w:p>
     <w:tbl>
       <w:tblPr>
@@ -13834,11 +13337,9 @@
       <w:pPr>
         <w:pStyle w:val="Heading2"/>
       </w:pPr>
-      <w:bookmarkStart w:name="_Toc33" w:id="33"/>
       <w:r>
         <w:t xml:space="preserve">9.2 Modelo do banco</w:t>
       </w:r>
-      <w:bookmarkEnd w:id="33"/>
     </w:p>
     <w:tbl>
       <w:tblPr>
@@ -14682,11 +14183,9 @@
       <w:pPr>
         <w:pStyle w:val="Heading2"/>
       </w:pPr>
-      <w:bookmarkStart w:name="_Toc34" w:id="34"/>
       <w:r>
         <w:t xml:space="preserve">9.3 Migrações</w:t>
       </w:r>
-      <w:bookmarkEnd w:id="34"/>
     </w:p>
     <w:p>
       <w:pPr>
@@ -14712,11 +14211,9 @@
       <w:pPr>
         <w:pStyle w:val="Heading2"/>
       </w:pPr>
-      <w:bookmarkStart w:name="_Toc35" w:id="35"/>
       <w:r>
         <w:t xml:space="preserve">9.4 Docker Compose</w:t>
       </w:r>
-      <w:bookmarkEnd w:id="35"/>
     </w:p>
     <w:tbl>
       <w:tblPr>
@@ -15567,11 +15064,9 @@
       <w:pPr>
         <w:pStyle w:val="Heading2"/>
       </w:pPr>
-      <w:bookmarkStart w:name="_Toc36" w:id="36"/>
       <w:r>
         <w:t xml:space="preserve">9.5 Variáveis de ambiente</w:t>
       </w:r>
-      <w:bookmarkEnd w:id="36"/>
     </w:p>
     <w:tbl>
       <w:tblPr>
@@ -16242,11 +15737,9 @@
         <w:pStyle w:val="Heading1"/>
         <w:pageBreakBefore/>
       </w:pPr>
-      <w:bookmarkStart w:name="_Toc37" w:id="37"/>
       <w:r>
         <w:t xml:space="preserve">10. Sincronização</w:t>
       </w:r>
-      <w:bookmarkEnd w:id="37"/>
     </w:p>
     <w:p>
       <w:pPr>
@@ -16347,11 +15840,9 @@
       <w:pPr>
         <w:pStyle w:val="Heading2"/>
       </w:pPr>
-      <w:bookmarkStart w:name="_Toc38" w:id="38"/>
       <w:r>
         <w:t xml:space="preserve">10.1 Regra de conflito</w:t>
       </w:r>
-      <w:bookmarkEnd w:id="38"/>
     </w:p>
     <w:p>
       <w:pPr>
@@ -16408,11 +15899,9 @@
       <w:pPr>
         <w:pStyle w:val="Heading2"/>
       </w:pPr>
-      <w:bookmarkStart w:name="_Toc39" w:id="39"/>
       <w:r>
         <w:t xml:space="preserve">10.2 Pontos de atenção para o cliente</w:t>
       </w:r>
-      <w:bookmarkEnd w:id="39"/>
     </w:p>
     <w:p>
       <w:pPr>
@@ -16556,11 +16045,9 @@
         <w:pStyle w:val="Heading1"/>
         <w:pageBreakBefore/>
       </w:pPr>
-      <w:bookmarkStart w:name="_Toc40" w:id="40"/>
       <w:r>
         <w:t xml:space="preserve">11. Design</w:t>
       </w:r>
-      <w:bookmarkEnd w:id="40"/>
     </w:p>
     <w:p>
       <w:pPr>
@@ -16767,11 +16254,9 @@
         <w:pStyle w:val="Heading1"/>
         <w:pageBreakBefore/>
       </w:pPr>
-      <w:bookmarkStart w:name="_Toc41" w:id="41"/>
       <w:r>
         <w:t xml:space="preserve">12. Qualidade e testes</w:t>
       </w:r>
-      <w:bookmarkEnd w:id="41"/>
     </w:p>
     <w:tbl>
       <w:tblPr>
@@ -17870,11 +17355,9 @@
       <w:pPr>
         <w:pStyle w:val="Heading2"/>
       </w:pPr>
-      <w:bookmarkStart w:name="_Toc42" w:id="42"/>
       <w:r>
         <w:t xml:space="preserve">12.1 Estratégia</w:t>
       </w:r>
-      <w:bookmarkEnd w:id="42"/>
     </w:p>
     <w:p>
       <w:pPr>
@@ -17940,11 +17423,9 @@
       <w:pPr>
         <w:pStyle w:val="Heading2"/>
       </w:pPr>
-      <w:bookmarkStart w:name="_Toc43" w:id="43"/>
       <w:r>
         <w:t xml:space="preserve">12.2 O que não foi verificado</w:t>
       </w:r>
-      <w:bookmarkEnd w:id="43"/>
     </w:p>
     <w:p>
       <w:pPr>
@@ -18003,21 +17484,17 @@
         <w:pStyle w:val="Heading1"/>
         <w:pageBreakBefore/>
       </w:pPr>
-      <w:bookmarkStart w:name="_Toc44" w:id="44"/>
       <w:r>
         <w:t xml:space="preserve">13. Operação</w:t>
       </w:r>
-      <w:bookmarkEnd w:id="44"/>
     </w:p>
     <w:p>
       <w:pPr>
         <w:pStyle w:val="Heading2"/>
       </w:pPr>
-      <w:bookmarkStart w:name="_Toc45" w:id="45"/>
       <w:r>
         <w:t xml:space="preserve">13.1 Subir o ambiente</w:t>
       </w:r>
-      <w:bookmarkEnd w:id="45"/>
     </w:p>
     <w:p>
       <w:pPr>
@@ -18096,11 +17573,9 @@
       <w:pPr>
         <w:pStyle w:val="Heading2"/>
       </w:pPr>
-      <w:bookmarkStart w:name="_Toc46" w:id="46"/>
       <w:r>
         <w:t xml:space="preserve">13.2 Acesso pela internet</w:t>
       </w:r>
-      <w:bookmarkEnd w:id="46"/>
     </w:p>
     <w:p>
       <w:pPr>
@@ -18182,11 +17657,9 @@
       <w:pPr>
         <w:pStyle w:val="Heading2"/>
       </w:pPr>
-      <w:bookmarkStart w:name="_Toc47" w:id="47"/>
       <w:r>
         <w:t xml:space="preserve">13.3 Backup e restauração</w:t>
       </w:r>
-      <w:bookmarkEnd w:id="47"/>
     </w:p>
     <w:p>
       <w:pPr>
@@ -18245,11 +17718,9 @@
       <w:pPr>
         <w:pStyle w:val="Heading2"/>
       </w:pPr>
-      <w:bookmarkStart w:name="_Toc48" w:id="48"/>
       <w:r>
         <w:t xml:space="preserve">13.4 Painel de agentes</w:t>
       </w:r>
-      <w:bookmarkEnd w:id="48"/>
     </w:p>
     <w:p>
       <w:pPr>
@@ -18284,11 +17755,9 @@
       <w:pPr>
         <w:pStyle w:val="Heading2"/>
       </w:pPr>
-      <w:bookmarkStart w:name="_Toc49" w:id="49"/>
       <w:r>
         <w:t xml:space="preserve">13.5 Instalação em iPhone</w:t>
       </w:r>
-      <w:bookmarkEnd w:id="49"/>
     </w:p>
     <w:p>
       <w:pPr>
@@ -18378,11 +17847,9 @@
       <w:pPr>
         <w:pStyle w:val="Heading2"/>
       </w:pPr>
-      <w:bookmarkStart w:name="_Toc50" w:id="50"/>
       <w:r>
         <w:t xml:space="preserve">13.6 Ferramentas de apoio</w:t>
       </w:r>
-      <w:bookmarkEnd w:id="50"/>
     </w:p>
     <w:p>
       <w:pPr>
@@ -18477,11 +17944,9 @@
         <w:pStyle w:val="Heading1"/>
         <w:pageBreakBefore/>
       </w:pPr>
-      <w:bookmarkStart w:name="_Toc51" w:id="51"/>
       <w:r>
         <w:t xml:space="preserve">14. Segurança e privacidade</w:t>
       </w:r>
-      <w:bookmarkEnd w:id="51"/>
     </w:p>
     <w:tbl>
       <w:tblPr>
@@ -19418,11 +18883,9 @@
       <w:pPr>
         <w:pStyle w:val="Heading2"/>
       </w:pPr>
-      <w:bookmarkStart w:name="_Toc52" w:id="52"/>
       <w:r>
         <w:t xml:space="preserve">14.1 LGPD</w:t>
       </w:r>
-      <w:bookmarkEnd w:id="52"/>
     </w:p>
     <w:p>
       <w:pPr>
@@ -19459,11 +18922,9 @@
         <w:pStyle w:val="Heading1"/>
         <w:pageBreakBefore/>
       </w:pPr>
-      <w:bookmarkStart w:name="_Toc53" w:id="53"/>
       <w:r>
         <w:t xml:space="preserve">15. Riscos e limitações</w:t>
       </w:r>
-      <w:bookmarkEnd w:id="53"/>
     </w:p>
     <w:tbl>
       <w:tblPr>
@@ -20560,11 +20021,9 @@
         <w:pStyle w:val="Heading1"/>
         <w:pageBreakBefore/>
       </w:pPr>
-      <w:bookmarkStart w:name="_Toc54" w:id="54"/>
       <w:r>
         <w:t xml:space="preserve">16. Roadmap</w:t>
       </w:r>
-      <w:bookmarkEnd w:id="54"/>
     </w:p>
     <w:tbl>
       <w:tblPr>
@@ -21308,11 +20767,9 @@
         <w:pStyle w:val="Heading1"/>
         <w:pageBreakBefore/>
       </w:pPr>
-      <w:bookmarkStart w:name="_Toc55" w:id="55"/>
       <w:r>
         <w:t xml:space="preserve">Apêndice A. Estrutura de diretórios</w:t>
       </w:r>
-      <w:bookmarkEnd w:id="55"/>
     </w:p>
     <w:p>
       <w:pPr>
@@ -21561,11 +21018,9 @@
       <w:pPr>
         <w:pStyle w:val="Heading1"/>
       </w:pPr>
-      <w:bookmarkStart w:name="_Toc56" w:id="56"/>
       <w:r>
         <w:t xml:space="preserve">Apêndice B. Documentos relacionados</w:t>
       </w:r>
-      <w:bookmarkEnd w:id="56"/>
     </w:p>
     <w:tbl>
       <w:tblPr>
@@ -22484,11 +21939,9 @@
       <w:pPr>
         <w:pStyle w:val="Heading1"/>
       </w:pPr>
-      <w:bookmarkStart w:name="_Toc57" w:id="57"/>
       <w:r>
         <w:t xml:space="preserve">Apêndice C. Diagramas ampliados</w:t>
       </w:r>
-      <w:bookmarkEnd w:id="57"/>
     </w:p>
     <w:p>
       <w:pPr>
@@ -22531,11 +21984,9 @@
       <w:pPr>
         <w:pStyle w:val="Heading2"/>
       </w:pPr>
-      <w:bookmarkStart w:name="_Toc58" w:id="58"/>
       <w:r>
         <w:t xml:space="preserve">C.1 Arquitetura completa</w:t>
       </w:r>
-      <w:bookmarkEnd w:id="58"/>
     </w:p>
     <w:p>
       <w:pPr>
@@ -22609,11 +22060,9 @@
       <w:pPr>
         <w:pStyle w:val="Heading2"/>
       </w:pPr>
-      <w:bookmarkStart w:name="_Toc59" w:id="59"/>
       <w:r>
         <w:t xml:space="preserve">C.2 Camadas do app iOS</w:t>
       </w:r>
-      <w:bookmarkEnd w:id="59"/>
     </w:p>
     <w:p>
       <w:pPr>
@@ -22687,11 +22136,9 @@
       <w:pPr>
         <w:pStyle w:val="Heading2"/>
       </w:pPr>
-      <w:bookmarkStart w:name="_Toc60" w:id="60"/>
       <w:r>
         <w:t xml:space="preserve">C.3 Modelo de dados do Core</w:t>
       </w:r>
-      <w:bookmarkEnd w:id="60"/>
     </w:p>
     <w:p>
       <w:pPr>
@@ -22765,11 +22212,9 @@
       <w:pPr>
         <w:pStyle w:val="Heading2"/>
       </w:pPr>
-      <w:bookmarkStart w:name="_Toc61" w:id="61"/>
       <w:r>
         <w:t xml:space="preserve">C.4 Compra no cartão e fatura</w:t>
       </w:r>
-      <w:bookmarkEnd w:id="61"/>
     </w:p>
     <w:p>
       <w:pPr>

</xml_diff>

<commit_message>
Refaz a arquitetura no modelo C4 (skill c4-architecture)
- docs/arquitetura/: contexto, contêineres, componentes (app iOS e API),
  implantação e fluxo dinâmico de sincronização, em Mermaid C4 validado com o parser.
- arquitetura-solucao.drawio agora tem uma página por nível C4 e uma visão geral;
  imagens exportadas em docs/arquitetura/img/.
- Documentação Word atualizada com os diagramas C4 e o apêndice ampliado.
- README e docs/arquitetura.md apontam para a nova estrutura.

Co-Authored-By: Claude Sonnet 5.5 <noreply@anthropic.com>
</commit_message>
<xml_diff>
--- a/docs/DOCUMENTACAO.docx
+++ b/docs/DOCUMENTACAO.docx
@@ -637,7 +637,7 @@
           <w:sz w:val="20"/>
           <w:szCs w:val="20"/>
         </w:rPr>
-        <w:t xml:space="preserve">5.1 Camadas do app iOS</w:t>
+        <w:t xml:space="preserve">5.1 Modelo C4</w:t>
       </w:r>
     </w:p>
     <w:p>
@@ -653,7 +653,7 @@
           <w:sz w:val="20"/>
           <w:szCs w:val="20"/>
         </w:rPr>
-        <w:t xml:space="preserve">5.2 Decisões de arquitetura</w:t>
+        <w:t xml:space="preserve">5.2 Camadas do app iOS</w:t>
       </w:r>
     </w:p>
     <w:p>
@@ -669,7 +669,23 @@
           <w:sz w:val="20"/>
           <w:szCs w:val="20"/>
         </w:rPr>
-        <w:t xml:space="preserve">5.3 Modelo de dados do Core</w:t>
+        <w:t xml:space="preserve">5.3 Decisões de arquitetura</w:t>
+      </w:r>
+    </w:p>
+    <w:p>
+      <w:pPr>
+        <w:spacing w:after="20" w:before="0"/>
+        <w:ind w:left="400"/>
+      </w:pPr>
+      <w:r>
+        <w:rPr>
+          <w:b w:val="false"/>
+          <w:bCs w:val="false"/>
+          <w:color w:val="5A6763"/>
+          <w:sz w:val="20"/>
+          <w:szCs w:val="20"/>
+        </w:rPr>
+        <w:t xml:space="preserve">5.4 Modelo de dados do Core</w:t>
       </w:r>
     </w:p>
     <w:p>
@@ -1389,7 +1405,7 @@
           <w:sz w:val="20"/>
           <w:szCs w:val="20"/>
         </w:rPr>
-        <w:t xml:space="preserve">C.1 Arquitetura completa</w:t>
+        <w:t xml:space="preserve">C.1 Contexto do sistema (C4 nível 1)</w:t>
       </w:r>
     </w:p>
     <w:p>
@@ -1405,7 +1421,7 @@
           <w:sz w:val="20"/>
           <w:szCs w:val="20"/>
         </w:rPr>
-        <w:t xml:space="preserve">C.2 Camadas do app iOS</w:t>
+        <w:t xml:space="preserve">C.2 Contêineres (C4 nível 2)</w:t>
       </w:r>
     </w:p>
     <w:p>
@@ -1421,7 +1437,7 @@
           <w:sz w:val="20"/>
           <w:szCs w:val="20"/>
         </w:rPr>
-        <w:t xml:space="preserve">C.3 Modelo de dados do Core</w:t>
+        <w:t xml:space="preserve">C.3 Componentes do app iOS (C4 nível 3)</w:t>
       </w:r>
     </w:p>
     <w:p>
@@ -1437,7 +1453,87 @@
           <w:sz w:val="20"/>
           <w:szCs w:val="20"/>
         </w:rPr>
-        <w:t xml:space="preserve">C.4 Compra no cartão e fatura</w:t>
+        <w:t xml:space="preserve">C.4 Componentes da API (C4 nível 3)</w:t>
+      </w:r>
+    </w:p>
+    <w:p>
+      <w:pPr>
+        <w:spacing w:after="20" w:before="0"/>
+        <w:ind w:left="400"/>
+      </w:pPr>
+      <w:r>
+        <w:rPr>
+          <w:b w:val="false"/>
+          <w:bCs w:val="false"/>
+          <w:color w:val="5A6763"/>
+          <w:sz w:val="20"/>
+          <w:szCs w:val="20"/>
+        </w:rPr>
+        <w:t xml:space="preserve">C.5 Implantação</w:t>
+      </w:r>
+    </w:p>
+    <w:p>
+      <w:pPr>
+        <w:spacing w:after="20" w:before="0"/>
+        <w:ind w:left="400"/>
+      </w:pPr>
+      <w:r>
+        <w:rPr>
+          <w:b w:val="false"/>
+          <w:bCs w:val="false"/>
+          <w:color w:val="5A6763"/>
+          <w:sz w:val="20"/>
+          <w:szCs w:val="20"/>
+        </w:rPr>
+        <w:t xml:space="preserve">C.6 Visão geral completa</w:t>
+      </w:r>
+    </w:p>
+    <w:p>
+      <w:pPr>
+        <w:spacing w:after="20" w:before="0"/>
+        <w:ind w:left="400"/>
+      </w:pPr>
+      <w:r>
+        <w:rPr>
+          <w:b w:val="false"/>
+          <w:bCs w:val="false"/>
+          <w:color w:val="5A6763"/>
+          <w:sz w:val="20"/>
+          <w:szCs w:val="20"/>
+        </w:rPr>
+        <w:t xml:space="preserve">C.7 Camadas do app iOS</w:t>
+      </w:r>
+    </w:p>
+    <w:p>
+      <w:pPr>
+        <w:spacing w:after="20" w:before="0"/>
+        <w:ind w:left="400"/>
+      </w:pPr>
+      <w:r>
+        <w:rPr>
+          <w:b w:val="false"/>
+          <w:bCs w:val="false"/>
+          <w:color w:val="5A6763"/>
+          <w:sz w:val="20"/>
+          <w:szCs w:val="20"/>
+        </w:rPr>
+        <w:t xml:space="preserve">C.8 Modelo de dados do Core</w:t>
+      </w:r>
+    </w:p>
+    <w:p>
+      <w:pPr>
+        <w:spacing w:after="20" w:before="0"/>
+        <w:ind w:left="400"/>
+      </w:pPr>
+      <w:r>
+        <w:rPr>
+          <w:b w:val="false"/>
+          <w:bCs w:val="false"/>
+          <w:color w:val="5A6763"/>
+          <w:sz w:val="20"/>
+          <w:szCs w:val="20"/>
+        </w:rPr>
+        <w:t xml:space="preserve">C.9 Compra no cartão e fatura</w:t>
       </w:r>
     </w:p>
     <w:p>
@@ -2211,9 +2307,9 @@
       <w:r>
         <w:drawing>
           <wp:inline distT="0" distB="0" distL="0" distR="0">
-            <wp:extent cx="5734050" cy="3800475"/>
+            <wp:extent cx="5734050" cy="3438525"/>
             <wp:effectExtent t="0" r="0" b="0" l="0"/>
-            <wp:docPr id="1" name="arquitetura-drawio" descr="Diagrama arquitetura-drawio" title="arquitetura-drawio"/>
+            <wp:docPr id="1" name="c4d-containers" descr="Diagrama c4d-containers" title="c4d-containers"/>
             <wp:cNvGraphicFramePr>
               <a:graphicFrameLocks xmlns:a="http://schemas.openxmlformats.org/drawingml/2006/main" noChangeAspect="1"/>
             </wp:cNvGraphicFramePr>
@@ -2236,7 +2332,7 @@
                   <pic:spPr bwMode="auto">
                     <a:xfrm>
                       <a:off x="0" y="0"/>
-                      <a:ext cx="5734050" cy="3800475"/>
+                      <a:ext cx="5734050" cy="3438525"/>
                     </a:xfrm>
                     <a:prstGeom prst="rect">
                       <a:avLst/>
@@ -2262,7 +2358,7 @@
           <w:sz w:val="18"/>
           <w:szCs w:val="18"/>
         </w:rPr>
-        <w:t xml:space="preserve">Figura 1. Arquitetura completa da solução (versão editável em docs/arquitetura/arquitetura-solucao.drawio).</w:t>
+        <w:t xml:space="preserve">Figura 1. Contêineres da solução, no modelo C4 (versão editável em docs/arquitetura/arquitetura-solucao.drawio).</w:t>
       </w:r>
     </w:p>
     <w:p>
@@ -6940,7 +7036,87 @@
         <w:pStyle w:val="Heading2"/>
       </w:pPr>
       <w:r>
-        <w:t xml:space="preserve">5.1 Camadas do app iOS</w:t>
+        <w:t xml:space="preserve">5.1 Modelo C4</w:t>
+      </w:r>
+    </w:p>
+    <w:p>
+      <w:pPr>
+        <w:spacing w:after="120" w:line="300"/>
+      </w:pPr>
+      <w:r>
+        <w:t xml:space="preserve">A arquitetura segue o modelo C4, em níveis de detalhe: </w:t>
+      </w:r>
+      <w:r>
+        <w:rPr>
+          <w:b/>
+          <w:bCs/>
+        </w:rPr>
+        <w:t xml:space="preserve">contexto</w:t>
+      </w:r>
+      <w:r>
+        <w:t xml:space="preserve"> (o sistema, as pessoas e os sistemas externos), </w:t>
+      </w:r>
+      <w:r>
+        <w:rPr>
+          <w:b/>
+          <w:bCs/>
+        </w:rPr>
+        <w:t xml:space="preserve">contêineres</w:t>
+      </w:r>
+      <w:r>
+        <w:t xml:space="preserve"> (o que é executável ou implantável), </w:t>
+      </w:r>
+      <w:r>
+        <w:rPr>
+          <w:b/>
+          <w:bCs/>
+        </w:rPr>
+        <w:t xml:space="preserve">componentes</w:t>
+      </w:r>
+      <w:r>
+        <w:t xml:space="preserve"> (o interior do app iOS e da API) e </w:t>
+      </w:r>
+      <w:r>
+        <w:rPr>
+          <w:b/>
+          <w:bCs/>
+        </w:rPr>
+        <w:t xml:space="preserve">implantação</w:t>
+      </w:r>
+      <w:r>
+        <w:t xml:space="preserve"> (onde cada contêiner roda). Uma biblioteca compartilhada, como o </w:t>
+      </w:r>
+      <w:r>
+        <w:rPr>
+          <w:rFonts w:ascii="Consolas" w:cs="Consolas" w:eastAsia="Consolas" w:hAnsi="Consolas"/>
+          <w:color w:val="9A3412"/>
+          <w:sz w:val="20"/>
+          <w:szCs w:val="20"/>
+        </w:rPr>
+        <w:t xml:space="preserve">Core</w:t>
+      </w:r>
+      <w:r>
+        <w:t xml:space="preserve">, não é contêiner: aparece como componente do app iOS. Os diagramas estão no Apêndice C e em </w:t>
+      </w:r>
+      <w:r>
+        <w:rPr>
+          <w:rFonts w:ascii="Consolas" w:cs="Consolas" w:eastAsia="Consolas" w:hAnsi="Consolas"/>
+          <w:color w:val="9A3412"/>
+          <w:sz w:val="20"/>
+          <w:szCs w:val="20"/>
+        </w:rPr>
+        <w:t xml:space="preserve">docs/arquitetura/</w:t>
+      </w:r>
+      <w:r>
+        <w:t xml:space="preserve">.</w:t>
+      </w:r>
+    </w:p>
+    <w:p>
+      <w:pPr>
+        <w:pStyle w:val="Heading2"/>
+      </w:pPr>
+      <w:r>
+        <w:t xml:space="preserve">5.2 Camadas do app iOS</w:t>
       </w:r>
     </w:p>
     <w:p>
@@ -7667,7 +7843,7 @@
         <w:pStyle w:val="Heading2"/>
       </w:pPr>
       <w:r>
-        <w:t xml:space="preserve">5.2 Decisões de arquitetura</w:t>
+        <w:t xml:space="preserve">5.3 Decisões de arquitetura</w:t>
       </w:r>
     </w:p>
     <w:tbl>
@@ -8523,7 +8699,7 @@
         <w:pStyle w:val="Heading2"/>
       </w:pPr>
       <w:r>
-        <w:t xml:space="preserve">5.3 Modelo de dados do Core</w:t>
+        <w:t xml:space="preserve">5.4 Modelo de dados do Core</w:t>
       </w:r>
     </w:p>
     <w:p>
@@ -21205,7 +21381,7 @@
                 <w:sz w:val="19"/>
                 <w:szCs w:val="19"/>
               </w:rPr>
-              <w:t xml:space="preserve">docs/arquitetura.md</w:t>
+              <w:t xml:space="preserve">docs/arquitetura/</w:t>
             </w:r>
           </w:p>
         </w:tc>
@@ -21234,7 +21410,7 @@
                 <w:sz w:val="19"/>
                 <w:szCs w:val="19"/>
               </w:rPr>
-              <w:t xml:space="preserve">Diagramas Mermaid renderizados pelo GitHub.</w:t>
+              <w:t xml:space="preserve">Arquitetura no modelo C4: Mermaid, imagens e draw.io.</w:t>
             </w:r>
           </w:p>
         </w:tc>
@@ -21299,7 +21475,72 @@
                 <w:sz w:val="19"/>
                 <w:szCs w:val="19"/>
               </w:rPr>
-              <w:t xml:space="preserve">Arquitetura completa editável.</w:t>
+              <w:t xml:space="preserve">Desenho editável, uma página por nível C4 e uma visão geral completa.</w:t>
+            </w:r>
+          </w:p>
+        </w:tc>
+      </w:tr>
+      <w:tr>
+        <w:trPr>
+          <w:cantSplit/>
+        </w:trPr>
+        <w:tc>
+          <w:tcPr>
+            <w:tcW w:type="dxa" w:w="4200"/>
+            <w:tcBorders>
+              <w:top w:val="single" w:color="C9D3CE" w:sz="4"/>
+              <w:left w:val="single" w:color="C9D3CE" w:sz="4"/>
+              <w:bottom w:val="single" w:color="C9D3CE" w:sz="4"/>
+              <w:right w:val="single" w:color="C9D3CE" w:sz="4"/>
+            </w:tcBorders>
+            <w:tcMar>
+              <w:top w:type="dxa" w:w="60"/>
+              <w:left w:type="dxa" w:w="100"/>
+              <w:bottom w:type="dxa" w:w="60"/>
+              <w:right w:type="dxa" w:w="100"/>
+            </w:tcMar>
+          </w:tcPr>
+          <w:p>
+            <w:pPr>
+              <w:spacing w:after="0"/>
+            </w:pPr>
+            <w:r>
+              <w:rPr>
+                <w:rFonts w:ascii="Consolas" w:cs="Consolas" w:eastAsia="Consolas" w:hAnsi="Consolas"/>
+                <w:color w:val="9A3412"/>
+                <w:sz w:val="19"/>
+                <w:szCs w:val="19"/>
+              </w:rPr>
+              <w:t xml:space="preserve">docs/arquitetura.md</w:t>
+            </w:r>
+          </w:p>
+        </w:tc>
+        <w:tc>
+          <w:tcPr>
+            <w:tcW w:type="dxa" w:w="4826"/>
+            <w:tcBorders>
+              <w:top w:val="single" w:color="C9D3CE" w:sz="4"/>
+              <w:left w:val="single" w:color="C9D3CE" w:sz="4"/>
+              <w:bottom w:val="single" w:color="C9D3CE" w:sz="4"/>
+              <w:right w:val="single" w:color="C9D3CE" w:sz="4"/>
+            </w:tcBorders>
+            <w:tcMar>
+              <w:top w:type="dxa" w:w="60"/>
+              <w:left w:type="dxa" w:w="100"/>
+              <w:bottom w:type="dxa" w:w="60"/>
+              <w:right w:type="dxa" w:w="100"/>
+            </w:tcMar>
+          </w:tcPr>
+          <w:p>
+            <w:pPr>
+              <w:spacing w:after="0"/>
+            </w:pPr>
+            <w:r>
+              <w:rPr>
+                <w:sz w:val="19"/>
+                <w:szCs w:val="19"/>
+              </w:rPr>
+              <w:t xml:space="preserve">Outros diagramas Mermaid: modelo de dados, sincronização, fatura, pipeline.</w:t>
             </w:r>
           </w:p>
         </w:tc>
@@ -21957,10 +22198,10 @@
           <w:sz w:val="20"/>
           <w:szCs w:val="20"/>
         </w:rPr>
-        <w:t xml:space="preserve">docs/arquitetura.md</w:t>
-      </w:r>
-      <w:r>
-        <w:t xml:space="preserve"> (Mermaid) e </w:t>
+        <w:t xml:space="preserve">docs/arquitetura/</w:t>
+      </w:r>
+      <w:r>
+        <w:t xml:space="preserve"> (C4 em Mermaid e draw.io) e </w:t>
       </w:r>
       <w:r>
         <w:rPr>
@@ -21969,10 +22210,10 @@
           <w:sz w:val="20"/>
           <w:szCs w:val="20"/>
         </w:rPr>
-        <w:t xml:space="preserve">docs/arquitetura/arquitetura-solucao.drawio</w:t>
-      </w:r>
-      <w:r>
-        <w:t xml:space="preserve">.</w:t>
+        <w:t xml:space="preserve">docs/arquitetura.md</w:t>
+      </w:r>
+      <w:r>
+        <w:t xml:space="preserve"> (outros diagramas Mermaid).</w:t>
       </w:r>
     </w:p>
     <w:p>
@@ -21985,7 +22226,7 @@
         <w:pStyle w:val="Heading2"/>
       </w:pPr>
       <w:r>
-        <w:t xml:space="preserve">C.1 Arquitetura completa</w:t>
+        <w:t xml:space="preserve">C.1 Contexto do sistema (C4 nível 1)</w:t>
       </w:r>
     </w:p>
     <w:p>
@@ -21997,9 +22238,85 @@
       <w:r>
         <w:drawing>
           <wp:inline distT="0" distB="0" distL="0" distR="0">
-            <wp:extent cx="7677150" cy="5086350"/>
+            <wp:extent cx="7677150" cy="4391025"/>
             <wp:effectExtent t="0" r="0" b="0" l="0"/>
-            <wp:docPr id="8" name="arquitetura-drawio" descr="Diagrama arquitetura-drawio" title="arquitetura-drawio"/>
+            <wp:docPr id="8" name="c4d-contexto" descr="Diagrama c4d-contexto" title="c4d-contexto"/>
+            <wp:cNvGraphicFramePr>
+              <a:graphicFrameLocks xmlns:a="http://schemas.openxmlformats.org/drawingml/2006/main" noChangeAspect="1"/>
+            </wp:cNvGraphicFramePr>
+            <a:graphic xmlns:a="http://schemas.openxmlformats.org/drawingml/2006/main">
+              <a:graphicData uri="http://schemas.openxmlformats.org/drawingml/2006/picture">
+                <pic:pic xmlns:pic="http://schemas.openxmlformats.org/drawingml/2006/picture">
+                  <pic:nvPicPr>
+                    <pic:cNvPr id="0" name="" descr=""/>
+                    <pic:cNvPicPr>
+                      <a:picLocks noChangeAspect="1" noChangeArrowheads="1"/>
+                    </pic:cNvPicPr>
+                  </pic:nvPicPr>
+                  <pic:blipFill>
+                    <a:blip r:embed="rId18" cstate="none"/>
+                    <a:srcRect/>
+                    <a:stretch>
+                      <a:fillRect/>
+                    </a:stretch>
+                  </pic:blipFill>
+                  <pic:spPr bwMode="auto">
+                    <a:xfrm>
+                      <a:off x="0" y="0"/>
+                      <a:ext cx="7677150" cy="4391025"/>
+                    </a:xfrm>
+                    <a:prstGeom prst="rect">
+                      <a:avLst/>
+                    </a:prstGeom>
+                  </pic:spPr>
+                </pic:pic>
+              </a:graphicData>
+            </a:graphic>
+          </wp:inline>
+        </w:drawing>
+      </w:r>
+    </w:p>
+    <w:p>
+      <w:pPr>
+        <w:spacing w:after="200"/>
+        <w:jc w:val="center"/>
+      </w:pPr>
+      <w:r>
+        <w:rPr>
+          <w:i/>
+          <w:iCs/>
+          <w:color w:val="5A6763"/>
+          <w:sz w:val="18"/>
+          <w:szCs w:val="18"/>
+        </w:rPr>
+        <w:t xml:space="preserve">Figura C1. Contexto do sistema.</w:t>
+      </w:r>
+    </w:p>
+    <w:p>
+      <w:r>
+        <w:br w:type="page"/>
+      </w:r>
+    </w:p>
+    <w:p>
+      <w:pPr>
+        <w:pStyle w:val="Heading2"/>
+      </w:pPr>
+      <w:r>
+        <w:t xml:space="preserve">C.2 Contêineres (C4 nível 2)</w:t>
+      </w:r>
+    </w:p>
+    <w:p>
+      <w:pPr>
+        <w:keepNext/>
+        <w:spacing w:after="60" w:before="80"/>
+        <w:jc w:val="center"/>
+      </w:pPr>
+      <w:r>
+        <w:drawing>
+          <wp:inline distT="0" distB="0" distL="0" distR="0">
+            <wp:extent cx="7677150" cy="4610100"/>
+            <wp:effectExtent t="0" r="0" b="0" l="0"/>
+            <wp:docPr id="9" name="c4d-containers" descr="Diagrama c4d-containers" title="c4d-containers"/>
             <wp:cNvGraphicFramePr>
               <a:graphicFrameLocks xmlns:a="http://schemas.openxmlformats.org/drawingml/2006/main" noChangeAspect="1"/>
             </wp:cNvGraphicFramePr>
@@ -22022,7 +22339,7 @@
                   <pic:spPr bwMode="auto">
                     <a:xfrm>
                       <a:off x="0" y="0"/>
-                      <a:ext cx="7677150" cy="5086350"/>
+                      <a:ext cx="7677150" cy="4610100"/>
                     </a:xfrm>
                     <a:prstGeom prst="rect">
                       <a:avLst/>
@@ -22048,7 +22365,7 @@
           <w:sz w:val="18"/>
           <w:szCs w:val="18"/>
         </w:rPr>
-        <w:t xml:space="preserve">Figura C1. Arquitetura da solução (draw.io).</w:t>
+        <w:t xml:space="preserve">Figura C2. Contêineres.</w:t>
       </w:r>
     </w:p>
     <w:p>
@@ -22061,7 +22378,7 @@
         <w:pStyle w:val="Heading2"/>
       </w:pPr>
       <w:r>
-        <w:t xml:space="preserve">C.2 Camadas do app iOS</w:t>
+        <w:t xml:space="preserve">C.3 Componentes do app iOS (C4 nível 3)</w:t>
       </w:r>
     </w:p>
     <w:p>
@@ -22073,85 +22390,9 @@
       <w:r>
         <w:drawing>
           <wp:inline distT="0" distB="0" distL="0" distR="0">
-            <wp:extent cx="5848350" cy="4838700"/>
+            <wp:extent cx="7677150" cy="4924425"/>
             <wp:effectExtent t="0" r="0" b="0" l="0"/>
-            <wp:docPr id="9" name="camadas-ios" descr="Diagrama camadas-ios" title="camadas-ios"/>
-            <wp:cNvGraphicFramePr>
-              <a:graphicFrameLocks xmlns:a="http://schemas.openxmlformats.org/drawingml/2006/main" noChangeAspect="1"/>
-            </wp:cNvGraphicFramePr>
-            <a:graphic xmlns:a="http://schemas.openxmlformats.org/drawingml/2006/main">
-              <a:graphicData uri="http://schemas.openxmlformats.org/drawingml/2006/picture">
-                <pic:pic xmlns:pic="http://schemas.openxmlformats.org/drawingml/2006/picture">
-                  <pic:nvPicPr>
-                    <pic:cNvPr id="0" name="" descr=""/>
-                    <pic:cNvPicPr>
-                      <a:picLocks noChangeAspect="1" noChangeArrowheads="1"/>
-                    </pic:cNvPicPr>
-                  </pic:nvPicPr>
-                  <pic:blipFill>
-                    <a:blip r:embed="rId18" cstate="none"/>
-                    <a:srcRect/>
-                    <a:stretch>
-                      <a:fillRect/>
-                    </a:stretch>
-                  </pic:blipFill>
-                  <pic:spPr bwMode="auto">
-                    <a:xfrm>
-                      <a:off x="0" y="0"/>
-                      <a:ext cx="5848350" cy="4838700"/>
-                    </a:xfrm>
-                    <a:prstGeom prst="rect">
-                      <a:avLst/>
-                    </a:prstGeom>
-                  </pic:spPr>
-                </pic:pic>
-              </a:graphicData>
-            </a:graphic>
-          </wp:inline>
-        </w:drawing>
-      </w:r>
-    </w:p>
-    <w:p>
-      <w:pPr>
-        <w:spacing w:after="200"/>
-        <w:jc w:val="center"/>
-      </w:pPr>
-      <w:r>
-        <w:rPr>
-          <w:i/>
-          <w:iCs/>
-          <w:color w:val="5A6763"/>
-          <w:sz w:val="18"/>
-          <w:szCs w:val="18"/>
-        </w:rPr>
-        <w:t xml:space="preserve">Figura C2. Camadas do app iOS.</w:t>
-      </w:r>
-    </w:p>
-    <w:p>
-      <w:r>
-        <w:br w:type="page"/>
-      </w:r>
-    </w:p>
-    <w:p>
-      <w:pPr>
-        <w:pStyle w:val="Heading2"/>
-      </w:pPr>
-      <w:r>
-        <w:t xml:space="preserve">C.3 Modelo de dados do Core</w:t>
-      </w:r>
-    </w:p>
-    <w:p>
-      <w:pPr>
-        <w:keepNext/>
-        <w:spacing w:after="60" w:before="80"/>
-        <w:jc w:val="center"/>
-      </w:pPr>
-      <w:r>
-        <w:drawing>
-          <wp:inline distT="0" distB="0" distL="0" distR="0">
-            <wp:extent cx="8591550" cy="3343275"/>
-            <wp:effectExtent t="0" r="0" b="0" l="0"/>
-            <wp:docPr id="10" name="er-core" descr="Diagrama er-core" title="er-core"/>
+            <wp:docPr id="10" name="c4d-componentes-ios" descr="Diagrama c4d-componentes-ios" title="c4d-componentes-ios"/>
             <wp:cNvGraphicFramePr>
               <a:graphicFrameLocks xmlns:a="http://schemas.openxmlformats.org/drawingml/2006/main" noChangeAspect="1"/>
             </wp:cNvGraphicFramePr>
@@ -22174,7 +22415,7 @@
                   <pic:spPr bwMode="auto">
                     <a:xfrm>
                       <a:off x="0" y="0"/>
-                      <a:ext cx="8591550" cy="3343275"/>
+                      <a:ext cx="7677150" cy="4924425"/>
                     </a:xfrm>
                     <a:prstGeom prst="rect">
                       <a:avLst/>
@@ -22200,7 +22441,7 @@
           <w:sz w:val="18"/>
           <w:szCs w:val="18"/>
         </w:rPr>
-        <w:t xml:space="preserve">Figura C3. Entidades do Core e seus relacionamentos.</w:t>
+        <w:t xml:space="preserve">Figura C3. Componentes do app iOS.</w:t>
       </w:r>
     </w:p>
     <w:p>
@@ -22213,7 +22454,7 @@
         <w:pStyle w:val="Heading2"/>
       </w:pPr>
       <w:r>
-        <w:t xml:space="preserve">C.4 Compra no cartão e fatura</w:t>
+        <w:t xml:space="preserve">C.4 Componentes da API (C4 nível 3)</w:t>
       </w:r>
     </w:p>
     <w:p>
@@ -22225,9 +22466,9 @@
       <w:r>
         <w:drawing>
           <wp:inline distT="0" distB="0" distL="0" distR="0">
-            <wp:extent cx="2009775" cy="5257800"/>
+            <wp:extent cx="7677150" cy="4181475"/>
             <wp:effectExtent t="0" r="0" b="0" l="0"/>
-            <wp:docPr id="11" name="fatura" descr="Diagrama fatura" title="fatura"/>
+            <wp:docPr id="11" name="c4d-componentes-api" descr="Diagrama c4d-componentes-api" title="c4d-componentes-api"/>
             <wp:cNvGraphicFramePr>
               <a:graphicFrameLocks xmlns:a="http://schemas.openxmlformats.org/drawingml/2006/main" noChangeAspect="1"/>
             </wp:cNvGraphicFramePr>
@@ -22250,6 +22491,386 @@
                   <pic:spPr bwMode="auto">
                     <a:xfrm>
                       <a:off x="0" y="0"/>
+                      <a:ext cx="7677150" cy="4181475"/>
+                    </a:xfrm>
+                    <a:prstGeom prst="rect">
+                      <a:avLst/>
+                    </a:prstGeom>
+                  </pic:spPr>
+                </pic:pic>
+              </a:graphicData>
+            </a:graphic>
+          </wp:inline>
+        </w:drawing>
+      </w:r>
+    </w:p>
+    <w:p>
+      <w:pPr>
+        <w:spacing w:after="200"/>
+        <w:jc w:val="center"/>
+      </w:pPr>
+      <w:r>
+        <w:rPr>
+          <w:i/>
+          <w:iCs/>
+          <w:color w:val="5A6763"/>
+          <w:sz w:val="18"/>
+          <w:szCs w:val="18"/>
+        </w:rPr>
+        <w:t xml:space="preserve">Figura C4. Componentes da API.</w:t>
+      </w:r>
+    </w:p>
+    <w:p>
+      <w:r>
+        <w:br w:type="page"/>
+      </w:r>
+    </w:p>
+    <w:p>
+      <w:pPr>
+        <w:pStyle w:val="Heading2"/>
+      </w:pPr>
+      <w:r>
+        <w:t xml:space="preserve">C.5 Implantação</w:t>
+      </w:r>
+    </w:p>
+    <w:p>
+      <w:pPr>
+        <w:keepNext/>
+        <w:spacing w:after="60" w:before="80"/>
+        <w:jc w:val="center"/>
+      </w:pPr>
+      <w:r>
+        <w:drawing>
+          <wp:inline distT="0" distB="0" distL="0" distR="0">
+            <wp:extent cx="7677150" cy="4276725"/>
+            <wp:effectExtent t="0" r="0" b="0" l="0"/>
+            <wp:docPr id="12" name="c4d-implantacao" descr="Diagrama c4d-implantacao" title="c4d-implantacao"/>
+            <wp:cNvGraphicFramePr>
+              <a:graphicFrameLocks xmlns:a="http://schemas.openxmlformats.org/drawingml/2006/main" noChangeAspect="1"/>
+            </wp:cNvGraphicFramePr>
+            <a:graphic xmlns:a="http://schemas.openxmlformats.org/drawingml/2006/main">
+              <a:graphicData uri="http://schemas.openxmlformats.org/drawingml/2006/picture">
+                <pic:pic xmlns:pic="http://schemas.openxmlformats.org/drawingml/2006/picture">
+                  <pic:nvPicPr>
+                    <pic:cNvPr id="0" name="" descr=""/>
+                    <pic:cNvPicPr>
+                      <a:picLocks noChangeAspect="1" noChangeArrowheads="1"/>
+                    </pic:cNvPicPr>
+                  </pic:nvPicPr>
+                  <pic:blipFill>
+                    <a:blip r:embed="rId21" cstate="none"/>
+                    <a:srcRect/>
+                    <a:stretch>
+                      <a:fillRect/>
+                    </a:stretch>
+                  </pic:blipFill>
+                  <pic:spPr bwMode="auto">
+                    <a:xfrm>
+                      <a:off x="0" y="0"/>
+                      <a:ext cx="7677150" cy="4276725"/>
+                    </a:xfrm>
+                    <a:prstGeom prst="rect">
+                      <a:avLst/>
+                    </a:prstGeom>
+                  </pic:spPr>
+                </pic:pic>
+              </a:graphicData>
+            </a:graphic>
+          </wp:inline>
+        </w:drawing>
+      </w:r>
+    </w:p>
+    <w:p>
+      <w:pPr>
+        <w:spacing w:after="200"/>
+        <w:jc w:val="center"/>
+      </w:pPr>
+      <w:r>
+        <w:rPr>
+          <w:i/>
+          <w:iCs/>
+          <w:color w:val="5A6763"/>
+          <w:sz w:val="18"/>
+          <w:szCs w:val="18"/>
+        </w:rPr>
+        <w:t xml:space="preserve">Figura C5. Implantação no ambiente atual.</w:t>
+      </w:r>
+    </w:p>
+    <w:p>
+      <w:r>
+        <w:br w:type="page"/>
+      </w:r>
+    </w:p>
+    <w:p>
+      <w:pPr>
+        <w:pStyle w:val="Heading2"/>
+      </w:pPr>
+      <w:r>
+        <w:t xml:space="preserve">C.6 Visão geral completa</w:t>
+      </w:r>
+    </w:p>
+    <w:p>
+      <w:pPr>
+        <w:keepNext/>
+        <w:spacing w:after="60" w:before="80"/>
+        <w:jc w:val="center"/>
+      </w:pPr>
+      <w:r>
+        <w:drawing>
+          <wp:inline distT="0" distB="0" distL="0" distR="0">
+            <wp:extent cx="7677150" cy="5086350"/>
+            <wp:effectExtent t="0" r="0" b="0" l="0"/>
+            <wp:docPr id="13" name="arquitetura-drawio" descr="Diagrama arquitetura-drawio" title="arquitetura-drawio"/>
+            <wp:cNvGraphicFramePr>
+              <a:graphicFrameLocks xmlns:a="http://schemas.openxmlformats.org/drawingml/2006/main" noChangeAspect="1"/>
+            </wp:cNvGraphicFramePr>
+            <a:graphic xmlns:a="http://schemas.openxmlformats.org/drawingml/2006/main">
+              <a:graphicData uri="http://schemas.openxmlformats.org/drawingml/2006/picture">
+                <pic:pic xmlns:pic="http://schemas.openxmlformats.org/drawingml/2006/picture">
+                  <pic:nvPicPr>
+                    <pic:cNvPr id="0" name="" descr=""/>
+                    <pic:cNvPicPr>
+                      <a:picLocks noChangeAspect="1" noChangeArrowheads="1"/>
+                    </pic:cNvPicPr>
+                  </pic:nvPicPr>
+                  <pic:blipFill>
+                    <a:blip r:embed="rId22" cstate="none"/>
+                    <a:srcRect/>
+                    <a:stretch>
+                      <a:fillRect/>
+                    </a:stretch>
+                  </pic:blipFill>
+                  <pic:spPr bwMode="auto">
+                    <a:xfrm>
+                      <a:off x="0" y="0"/>
+                      <a:ext cx="7677150" cy="5086350"/>
+                    </a:xfrm>
+                    <a:prstGeom prst="rect">
+                      <a:avLst/>
+                    </a:prstGeom>
+                  </pic:spPr>
+                </pic:pic>
+              </a:graphicData>
+            </a:graphic>
+          </wp:inline>
+        </w:drawing>
+      </w:r>
+    </w:p>
+    <w:p>
+      <w:pPr>
+        <w:spacing w:after="200"/>
+        <w:jc w:val="center"/>
+      </w:pPr>
+      <w:r>
+        <w:rPr>
+          <w:i/>
+          <w:iCs/>
+          <w:color w:val="5A6763"/>
+          <w:sz w:val="18"/>
+          <w:szCs w:val="18"/>
+        </w:rPr>
+        <w:t xml:space="preserve">Figura C6. Visão geral completa (todas as partes em uma página).</w:t>
+      </w:r>
+    </w:p>
+    <w:p>
+      <w:r>
+        <w:br w:type="page"/>
+      </w:r>
+    </w:p>
+    <w:p>
+      <w:pPr>
+        <w:pStyle w:val="Heading2"/>
+      </w:pPr>
+      <w:r>
+        <w:t xml:space="preserve">C.7 Camadas do app iOS</w:t>
+      </w:r>
+    </w:p>
+    <w:p>
+      <w:pPr>
+        <w:keepNext/>
+        <w:spacing w:after="60" w:before="80"/>
+        <w:jc w:val="center"/>
+      </w:pPr>
+      <w:r>
+        <w:drawing>
+          <wp:inline distT="0" distB="0" distL="0" distR="0">
+            <wp:extent cx="5667375" cy="4686300"/>
+            <wp:effectExtent t="0" r="0" b="0" l="0"/>
+            <wp:docPr id="14" name="camadas-ios" descr="Diagrama camadas-ios" title="camadas-ios"/>
+            <wp:cNvGraphicFramePr>
+              <a:graphicFrameLocks xmlns:a="http://schemas.openxmlformats.org/drawingml/2006/main" noChangeAspect="1"/>
+            </wp:cNvGraphicFramePr>
+            <a:graphic xmlns:a="http://schemas.openxmlformats.org/drawingml/2006/main">
+              <a:graphicData uri="http://schemas.openxmlformats.org/drawingml/2006/picture">
+                <pic:pic xmlns:pic="http://schemas.openxmlformats.org/drawingml/2006/picture">
+                  <pic:nvPicPr>
+                    <pic:cNvPr id="0" name="" descr=""/>
+                    <pic:cNvPicPr>
+                      <a:picLocks noChangeAspect="1" noChangeArrowheads="1"/>
+                    </pic:cNvPicPr>
+                  </pic:nvPicPr>
+                  <pic:blipFill>
+                    <a:blip r:embed="rId23" cstate="none"/>
+                    <a:srcRect/>
+                    <a:stretch>
+                      <a:fillRect/>
+                    </a:stretch>
+                  </pic:blipFill>
+                  <pic:spPr bwMode="auto">
+                    <a:xfrm>
+                      <a:off x="0" y="0"/>
+                      <a:ext cx="5667375" cy="4686300"/>
+                    </a:xfrm>
+                    <a:prstGeom prst="rect">
+                      <a:avLst/>
+                    </a:prstGeom>
+                  </pic:spPr>
+                </pic:pic>
+              </a:graphicData>
+            </a:graphic>
+          </wp:inline>
+        </w:drawing>
+      </w:r>
+    </w:p>
+    <w:p>
+      <w:pPr>
+        <w:spacing w:after="200"/>
+        <w:jc w:val="center"/>
+      </w:pPr>
+      <w:r>
+        <w:rPr>
+          <w:i/>
+          <w:iCs/>
+          <w:color w:val="5A6763"/>
+          <w:sz w:val="18"/>
+          <w:szCs w:val="18"/>
+        </w:rPr>
+        <w:t xml:space="preserve">Figura C7. Camadas do app iOS.</w:t>
+      </w:r>
+    </w:p>
+    <w:p>
+      <w:r>
+        <w:br w:type="page"/>
+      </w:r>
+    </w:p>
+    <w:p>
+      <w:pPr>
+        <w:pStyle w:val="Heading2"/>
+      </w:pPr>
+      <w:r>
+        <w:t xml:space="preserve">C.8 Modelo de dados do Core</w:t>
+      </w:r>
+    </w:p>
+    <w:p>
+      <w:pPr>
+        <w:keepNext/>
+        <w:spacing w:after="60" w:before="80"/>
+        <w:jc w:val="center"/>
+      </w:pPr>
+      <w:r>
+        <w:drawing>
+          <wp:inline distT="0" distB="0" distL="0" distR="0">
+            <wp:extent cx="8591550" cy="3343275"/>
+            <wp:effectExtent t="0" r="0" b="0" l="0"/>
+            <wp:docPr id="15" name="er-core" descr="Diagrama er-core" title="er-core"/>
+            <wp:cNvGraphicFramePr>
+              <a:graphicFrameLocks xmlns:a="http://schemas.openxmlformats.org/drawingml/2006/main" noChangeAspect="1"/>
+            </wp:cNvGraphicFramePr>
+            <a:graphic xmlns:a="http://schemas.openxmlformats.org/drawingml/2006/main">
+              <a:graphicData uri="http://schemas.openxmlformats.org/drawingml/2006/picture">
+                <pic:pic xmlns:pic="http://schemas.openxmlformats.org/drawingml/2006/picture">
+                  <pic:nvPicPr>
+                    <pic:cNvPr id="0" name="" descr=""/>
+                    <pic:cNvPicPr>
+                      <a:picLocks noChangeAspect="1" noChangeArrowheads="1"/>
+                    </pic:cNvPicPr>
+                  </pic:nvPicPr>
+                  <pic:blipFill>
+                    <a:blip r:embed="rId24" cstate="none"/>
+                    <a:srcRect/>
+                    <a:stretch>
+                      <a:fillRect/>
+                    </a:stretch>
+                  </pic:blipFill>
+                  <pic:spPr bwMode="auto">
+                    <a:xfrm>
+                      <a:off x="0" y="0"/>
+                      <a:ext cx="8591550" cy="3343275"/>
+                    </a:xfrm>
+                    <a:prstGeom prst="rect">
+                      <a:avLst/>
+                    </a:prstGeom>
+                  </pic:spPr>
+                </pic:pic>
+              </a:graphicData>
+            </a:graphic>
+          </wp:inline>
+        </w:drawing>
+      </w:r>
+    </w:p>
+    <w:p>
+      <w:pPr>
+        <w:spacing w:after="200"/>
+        <w:jc w:val="center"/>
+      </w:pPr>
+      <w:r>
+        <w:rPr>
+          <w:i/>
+          <w:iCs/>
+          <w:color w:val="5A6763"/>
+          <w:sz w:val="18"/>
+          <w:szCs w:val="18"/>
+        </w:rPr>
+        <w:t xml:space="preserve">Figura C8. Entidades do Core e seus relacionamentos.</w:t>
+      </w:r>
+    </w:p>
+    <w:p>
+      <w:r>
+        <w:br w:type="page"/>
+      </w:r>
+    </w:p>
+    <w:p>
+      <w:pPr>
+        <w:pStyle w:val="Heading2"/>
+      </w:pPr>
+      <w:r>
+        <w:t xml:space="preserve">C.9 Compra no cartão e fatura</w:t>
+      </w:r>
+    </w:p>
+    <w:p>
+      <w:pPr>
+        <w:keepNext/>
+        <w:spacing w:after="60" w:before="80"/>
+        <w:jc w:val="center"/>
+      </w:pPr>
+      <w:r>
+        <w:drawing>
+          <wp:inline distT="0" distB="0" distL="0" distR="0">
+            <wp:extent cx="2009775" cy="5257800"/>
+            <wp:effectExtent t="0" r="0" b="0" l="0"/>
+            <wp:docPr id="16" name="fatura" descr="Diagrama fatura" title="fatura"/>
+            <wp:cNvGraphicFramePr>
+              <a:graphicFrameLocks xmlns:a="http://schemas.openxmlformats.org/drawingml/2006/main" noChangeAspect="1"/>
+            </wp:cNvGraphicFramePr>
+            <a:graphic xmlns:a="http://schemas.openxmlformats.org/drawingml/2006/main">
+              <a:graphicData uri="http://schemas.openxmlformats.org/drawingml/2006/picture">
+                <pic:pic xmlns:pic="http://schemas.openxmlformats.org/drawingml/2006/picture">
+                  <pic:nvPicPr>
+                    <pic:cNvPr id="0" name="" descr=""/>
+                    <pic:cNvPicPr>
+                      <a:picLocks noChangeAspect="1" noChangeArrowheads="1"/>
+                    </pic:cNvPicPr>
+                  </pic:nvPicPr>
+                  <pic:blipFill>
+                    <a:blip r:embed="rId25" cstate="none"/>
+                    <a:srcRect/>
+                    <a:stretch>
+                      <a:fillRect/>
+                    </a:stretch>
+                  </pic:blipFill>
+                  <pic:spPr bwMode="auto">
+                    <a:xfrm>
+                      <a:off x="0" y="0"/>
                       <a:ext cx="2009775" cy="5257800"/>
                     </a:xfrm>
                     <a:prstGeom prst="rect">
@@ -22276,7 +22897,7 @@
           <w:sz w:val="18"/>
           <w:szCs w:val="18"/>
         </w:rPr>
-        <w:t xml:space="preserve">Figura C4. Fluxo da compra no cartão até o pagamento da fatura.</w:t>
+        <w:t xml:space="preserve">Figura C9. Fluxo da compra no cartão até o pagamento da fatura.</w:t>
       </w:r>
     </w:p>
     <w:sectPr>

</xml_diff>